<commit_message>
feat(diploma-math): add DOCX post-processor for МГТУ formatting
postprocess_docx.py applies МГТУ Bauman rules to pandoc-generated DOCX:
- Headings: all 14pt bold TNR; structural headings (ВВЕДЕНИЕ, ЗАКЛЮЧЕНИЕ,
  СПИСОК...) → centered, no indent; numbered headings (1, 1.1...) → left
- Lists: detect numPr in XML (pandoc uses Normal+numPr, not List style),
  remove bullet, prepend "-- ", set hanging indent 1.25cm
- Formula paragraphs: center alignment, zero indent
- "где" paragraphs: remove first-line indent

export.sh updated: uses /Users/kbalashova/Applications/pandoc/pandoc path,
passes chapters as array (fixes space-in-path issue), runs postprocess
on raw pandoc output and removes intermediate file.

FORMAT.md: headings → 14pt bold (was 16pt); heading3_bold: true.

Co-Authored-By: Claude Sonnet 4.6 <noreply@anthropic.com>
</commit_message>
<xml_diff>
--- a/projects/diploma_math_modeling/output/diploma_math_2026-05-17.docx
+++ b/projects/diploma_math_modeling/output/diploma_math_2026-05-17.docx
@@ -32,8 +32,16 @@
     <w:p>
       <w:pPr>
         <w:pStyle w:val="Heading1"/>
-      </w:pPr>
-      <w:r>
+        <w:ind w:firstLine="0" w:left="0"/>
+        <w:jc w:val="center"/>
+      </w:pPr>
+      <w:r>
+        <w:rPr>
+          <w:rFonts w:ascii="Times New Roman" w:hAnsi="Times New Roman"/>
+          <w:b/>
+          <w:i w:val="0"/>
+          <w:sz w:val="28"/>
+        </w:rPr>
         <w:t xml:space="preserve">ВВЕДЕНИЕ</w:t>
       </w:r>
     </w:p>
@@ -95,13 +103,11 @@
     </w:p>
     <w:p>
       <w:pPr>
-        <w:numPr>
-          <w:ilvl w:val="0"/>
-          <w:numId w:val="1001"/>
-        </w:numPr>
-      </w:pPr>
-      <w:r>
-        <w:t xml:space="preserve">построение динамической матричной модели межотраслевого баланса с эндогенными матрицами прямых затрат</w:t>
+        <w:spacing w:before="0" w:after="0"/>
+        <w:ind w:left="992" w:hanging="283"/>
+      </w:pPr>
+      <w:r>
+        <w:t>-- построение динамической матричной модели межотраслевого баланса с эндогенными матрицами прямых затрат</w:t>
       </w:r>
       <w:r>
         <w:t xml:space="preserve"> </w:t>
@@ -164,46 +170,38 @@
     </w:p>
     <w:p>
       <w:pPr>
-        <w:numPr>
-          <w:ilvl w:val="0"/>
-          <w:numId w:val="1001"/>
-        </w:numPr>
-      </w:pPr>
-      <w:r>
-        <w:t xml:space="preserve">разработка микроуровня модели – совокупности 159 гетерогенных фирм-агентов, принимающих решения в соответствии с правилами ограниченной рациональности;</w:t>
-      </w:r>
-    </w:p>
-    <w:p>
-      <w:pPr>
-        <w:numPr>
-          <w:ilvl w:val="0"/>
-          <w:numId w:val="1001"/>
-        </w:numPr>
-      </w:pPr>
-      <w:r>
-        <w:t xml:space="preserve">калибровка начальных параметров по симметричным таблицам «затраты–выпуск» базы данных Eurostat (серия naio_10_cp1700, базовый год – 2015) и временным рядам отраслевых показателей за период 2010–2019 годов;</w:t>
-      </w:r>
-    </w:p>
-    <w:p>
-      <w:pPr>
-        <w:numPr>
-          <w:ilvl w:val="0"/>
-          <w:numId w:val="1001"/>
-        </w:numPr>
-      </w:pPr>
-      <w:r>
-        <w:t xml:space="preserve">программная реализация модели на языке Python и верификация начальных условий симуляции;</w:t>
-      </w:r>
-    </w:p>
-    <w:p>
-      <w:pPr>
-        <w:numPr>
-          <w:ilvl w:val="0"/>
-          <w:numId w:val="1001"/>
-        </w:numPr>
-      </w:pPr>
-      <w:r>
-        <w:t xml:space="preserve">форвардная симуляция на горизонте 30 шагов и анализ макро- и микродинамики системы.</w:t>
+        <w:spacing w:before="0" w:after="0"/>
+        <w:ind w:left="992" w:hanging="283"/>
+      </w:pPr>
+      <w:r>
+        <w:t>-- разработка микроуровня модели – совокупности 159 гетерогенных фирм-агентов, принимающих решения в соответствии с правилами ограниченной рациональности;</w:t>
+      </w:r>
+    </w:p>
+    <w:p>
+      <w:pPr>
+        <w:spacing w:before="0" w:after="0"/>
+        <w:ind w:left="992" w:hanging="283"/>
+      </w:pPr>
+      <w:r>
+        <w:t>-- калибровка начальных параметров по симметричным таблицам «затраты–выпуск» базы данных Eurostat (серия naio_10_cp1700, базовый год – 2015) и временным рядам отраслевых показателей за период 2010–2019 годов;</w:t>
+      </w:r>
+    </w:p>
+    <w:p>
+      <w:pPr>
+        <w:spacing w:before="0" w:after="0"/>
+        <w:ind w:left="992" w:hanging="283"/>
+      </w:pPr>
+      <w:r>
+        <w:t>-- программная реализация модели на языке Python и верификация начальных условий симуляции;</w:t>
+      </w:r>
+    </w:p>
+    <w:p>
+      <w:pPr>
+        <w:spacing w:before="0" w:after="0"/>
+        <w:ind w:left="992" w:hanging="283"/>
+      </w:pPr>
+      <w:r>
+        <w:t>-- форвардная симуляция на горизонте 30 шагов и анализ макро- и микродинамики системы.</w:t>
       </w:r>
     </w:p>
     <w:p>
@@ -216,38 +214,29 @@
     </w:p>
     <w:p>
       <w:pPr>
-        <w:pStyle w:val="Compact"/>
-        <w:numPr>
-          <w:ilvl w:val="0"/>
-          <w:numId w:val="1002"/>
-        </w:numPr>
-      </w:pPr>
-      <w:r>
-        <w:t xml:space="preserve">аппарат динамического межотраслевого баланса Леонтьева в дискретном времени;</w:t>
-      </w:r>
-    </w:p>
-    <w:p>
-      <w:pPr>
-        <w:pStyle w:val="Compact"/>
-        <w:numPr>
-          <w:ilvl w:val="0"/>
-          <w:numId w:val="1002"/>
-        </w:numPr>
-      </w:pPr>
-      <w:r>
-        <w:t xml:space="preserve">агентно-ориентированное моделирование с ограниченной рациональностью агентов в духе концепции Г. Саймона;</w:t>
-      </w:r>
-    </w:p>
-    <w:p>
-      <w:pPr>
-        <w:pStyle w:val="Compact"/>
-        <w:numPr>
-          <w:ilvl w:val="0"/>
-          <w:numId w:val="1002"/>
-        </w:numPr>
-      </w:pPr>
-      <w:r>
-        <w:t xml:space="preserve">методы матричного анализа – сингулярное разложение (SVD) и псевдообратная матрица Мура–Пенроуза – для обработки вырожденной матрицы</w:t>
+        <w:spacing w:before="0" w:after="0"/>
+        <w:ind w:left="992" w:hanging="283"/>
+      </w:pPr>
+      <w:r>
+        <w:t>-- аппарат динамического межотраслевого баланса Леонтьева в дискретном времени;</w:t>
+      </w:r>
+    </w:p>
+    <w:p>
+      <w:pPr>
+        <w:spacing w:before="0" w:after="0"/>
+        <w:ind w:left="992" w:hanging="283"/>
+      </w:pPr>
+      <w:r>
+        <w:t>-- агентно-ориентированное моделирование с ограниченной рациональностью агентов в духе концепции Г. Саймона;</w:t>
+      </w:r>
+    </w:p>
+    <w:p>
+      <w:pPr>
+        <w:spacing w:before="0" w:after="0"/>
+        <w:ind w:left="992" w:hanging="283"/>
+      </w:pPr>
+      <w:r>
+        <w:t>-- методы матричного анализа – сингулярное разложение (SVD) и псевдообратная матрица Мура–Пенроуза – для обработки вырожденной матрицы</w:t>
       </w:r>
       <w:r>
         <w:t xml:space="preserve"> </w:t>
@@ -278,14 +267,11 @@
     </w:p>
     <w:p>
       <w:pPr>
-        <w:pStyle w:val="Compact"/>
-        <w:numPr>
-          <w:ilvl w:val="0"/>
-          <w:numId w:val="1002"/>
-        </w:numPr>
-      </w:pPr>
-      <w:r>
-        <w:t xml:space="preserve">LU-разложение для численного решения балансовой системы на каждом шаге симуляции.</w:t>
+        <w:spacing w:before="0" w:after="0"/>
+        <w:ind w:left="992" w:hanging="283"/>
+      </w:pPr>
+      <w:r>
+        <w:t>-- LU-разложение для численного решения балансовой системы на каждом шаге симуляции.</w:t>
       </w:r>
     </w:p>
     <w:p>
@@ -375,8 +361,16 @@
     <w:p>
       <w:pPr>
         <w:pStyle w:val="Heading1"/>
-      </w:pPr>
-      <w:r>
+        <w:ind w:firstLine="709" w:left="0"/>
+        <w:jc w:val="left"/>
+      </w:pPr>
+      <w:r>
+        <w:rPr>
+          <w:rFonts w:ascii="Times New Roman" w:hAnsi="Times New Roman"/>
+          <w:b/>
+          <w:i w:val="0"/>
+          <w:sz w:val="28"/>
+        </w:rPr>
         <w:t xml:space="preserve">1 Межотраслевой баланс как инструмент макроэкономического анализа</w:t>
       </w:r>
     </w:p>
@@ -384,8 +378,16 @@
     <w:p>
       <w:pPr>
         <w:pStyle w:val="Heading2"/>
-      </w:pPr>
-      <w:r>
+        <w:ind w:firstLine="709" w:left="0"/>
+        <w:jc w:val="left"/>
+      </w:pPr>
+      <w:r>
+        <w:rPr>
+          <w:rFonts w:ascii="Times New Roman" w:hAnsi="Times New Roman"/>
+          <w:b/>
+          <w:i w:val="0"/>
+          <w:sz w:val="28"/>
+        </w:rPr>
         <w:t xml:space="preserve">1.1 Актуальность задачи моделирования макроэкономической динамики</w:t>
       </w:r>
     </w:p>
@@ -426,8 +428,16 @@
     <w:p>
       <w:pPr>
         <w:pStyle w:val="Heading2"/>
-      </w:pPr>
-      <w:r>
+        <w:ind w:firstLine="709" w:left="0"/>
+        <w:jc w:val="left"/>
+      </w:pPr>
+      <w:r>
+        <w:rPr>
+          <w:rFonts w:ascii="Times New Roman" w:hAnsi="Times New Roman"/>
+          <w:b/>
+          <w:i w:val="0"/>
+          <w:sz w:val="28"/>
+        </w:rPr>
         <w:t xml:space="preserve">1.2 Основные понятия и категории</w:t>
       </w:r>
     </w:p>
@@ -532,6 +542,9 @@
     <w:p>
       <w:pPr>
         <w:pStyle w:val="BodyText"/>
+        <w:spacing w:before="120" w:after="120"/>
+        <w:ind w:firstLine="0" w:left="0"/>
+        <w:jc w:val="center"/>
       </w:pPr>
       <m:oMath>
         <m:sSub>
@@ -637,6 +650,8 @@
     <w:p>
       <w:pPr>
         <w:pStyle w:val="BodyText"/>
+        <w:ind w:firstLine="0" w:left="0"/>
+        <w:jc w:val="left"/>
       </w:pPr>
       <w:r>
         <w:t xml:space="preserve">где</w:t>
@@ -820,6 +835,9 @@
     <w:p>
       <w:pPr>
         <w:pStyle w:val="BodyText"/>
+        <w:spacing w:before="120" w:after="120"/>
+        <w:ind w:firstLine="0" w:left="0"/>
+        <w:jc w:val="center"/>
       </w:pPr>
       <m:oMath>
         <m:sSub>
@@ -933,6 +951,9 @@
     <w:p>
       <w:pPr>
         <w:pStyle w:val="BodyText"/>
+        <w:spacing w:before="120" w:after="120"/>
+        <w:ind w:firstLine="0" w:left="0"/>
+        <w:jc w:val="center"/>
       </w:pPr>
       <m:oMath>
         <m:nary>
@@ -1114,6 +1135,9 @@
     <w:p>
       <w:pPr>
         <w:pStyle w:val="BodyText"/>
+        <w:spacing w:before="120" w:after="120"/>
+        <w:ind w:firstLine="0" w:left="0"/>
+        <w:jc w:val="center"/>
       </w:pPr>
       <m:oMath>
         <m:sSub>
@@ -1338,6 +1362,9 @@
     <w:p>
       <w:pPr>
         <w:pStyle w:val="BodyText"/>
+        <w:spacing w:before="120" w:after="120"/>
+        <w:ind w:firstLine="0" w:left="0"/>
+        <w:jc w:val="center"/>
       </w:pPr>
       <m:oMath>
         <m:sSub>
@@ -1496,6 +1523,9 @@
     <w:p>
       <w:pPr>
         <w:pStyle w:val="BodyText"/>
+        <w:spacing w:before="120" w:after="120"/>
+        <w:ind w:firstLine="0" w:left="0"/>
+        <w:jc w:val="center"/>
       </w:pPr>
       <m:oMath>
         <m:r>
@@ -1560,8 +1590,16 @@
     <w:p>
       <w:pPr>
         <w:pStyle w:val="Heading2"/>
-      </w:pPr>
-      <w:r>
+        <w:ind w:firstLine="709" w:left="0"/>
+        <w:jc w:val="left"/>
+      </w:pPr>
+      <w:r>
+        <w:rPr>
+          <w:rFonts w:ascii="Times New Roman" w:hAnsi="Times New Roman"/>
+          <w:b/>
+          <w:i w:val="0"/>
+          <w:sz w:val="28"/>
+        </w:rPr>
         <w:t xml:space="preserve">1.3 Статическая модель Леонтьева</w:t>
       </w:r>
     </w:p>
@@ -1608,6 +1646,9 @@
     <w:p>
       <w:pPr>
         <w:pStyle w:val="BodyText"/>
+        <w:spacing w:before="120" w:after="120"/>
+        <w:ind w:firstLine="0" w:left="0"/>
+        <w:jc w:val="center"/>
       </w:pPr>
       <m:oMath>
         <m:sSub>
@@ -1733,6 +1774,9 @@
     <w:p>
       <w:pPr>
         <w:pStyle w:val="BodyText"/>
+        <w:spacing w:before="120" w:after="120"/>
+        <w:ind w:firstLine="0" w:left="0"/>
+        <w:jc w:val="center"/>
       </w:pPr>
       <m:oMath>
         <m:r>
@@ -1782,6 +1826,8 @@
     <w:p>
       <w:pPr>
         <w:pStyle w:val="BodyText"/>
+        <w:ind w:firstLine="0" w:left="0"/>
+        <w:jc w:val="left"/>
       </w:pPr>
       <w:r>
         <w:t xml:space="preserve">где</w:t>
@@ -1926,6 +1972,9 @@
     <w:p>
       <w:pPr>
         <w:pStyle w:val="BodyText"/>
+        <w:spacing w:before="120" w:after="120"/>
+        <w:ind w:firstLine="0" w:left="0"/>
+        <w:jc w:val="center"/>
       </w:pPr>
       <m:oMath>
         <m:r>
@@ -1995,6 +2044,9 @@
     <w:p>
       <w:pPr>
         <w:pStyle w:val="BodyText"/>
+        <w:spacing w:before="120" w:after="120"/>
+        <w:ind w:firstLine="0" w:left="0"/>
+        <w:jc w:val="center"/>
       </w:pPr>
       <m:oMath>
         <m:r>
@@ -2746,8 +2798,16 @@
     <w:p>
       <w:pPr>
         <w:pStyle w:val="Heading2"/>
-      </w:pPr>
-      <w:r>
+        <w:ind w:firstLine="709" w:left="0"/>
+        <w:jc w:val="left"/>
+      </w:pPr>
+      <w:r>
+        <w:rPr>
+          <w:rFonts w:ascii="Times New Roman" w:hAnsi="Times New Roman"/>
+          <w:b/>
+          <w:i w:val="0"/>
+          <w:sz w:val="28"/>
+        </w:rPr>
         <w:t xml:space="preserve">1.4 Динамическая модель Леонтьева</w:t>
       </w:r>
     </w:p>
@@ -2980,6 +3040,9 @@
     <w:p>
       <w:pPr>
         <w:pStyle w:val="BodyText"/>
+        <w:spacing w:before="120" w:after="120"/>
+        <w:ind w:firstLine="0" w:left="0"/>
+        <w:jc w:val="center"/>
       </w:pPr>
       <m:oMath>
         <m:r>
@@ -3170,6 +3233,8 @@
     <w:p>
       <w:pPr>
         <w:pStyle w:val="BodyText"/>
+        <w:ind w:firstLine="0" w:left="0"/>
+        <w:jc w:val="left"/>
       </w:pPr>
       <w:r>
         <w:t xml:space="preserve">где</w:t>
@@ -3549,6 +3614,9 @@
     <w:p>
       <w:pPr>
         <w:pStyle w:val="BodyText"/>
+        <w:spacing w:before="120" w:after="120"/>
+        <w:ind w:firstLine="0" w:left="0"/>
+        <w:jc w:val="center"/>
       </w:pPr>
       <m:oMath>
         <m:r>
@@ -3905,6 +3973,9 @@
     <w:p>
       <w:pPr>
         <w:pStyle w:val="BodyText"/>
+        <w:spacing w:before="120" w:after="120"/>
+        <w:ind w:firstLine="0" w:left="0"/>
+        <w:jc w:val="center"/>
       </w:pPr>
       <m:oMath>
         <m:r>
@@ -4575,6 +4646,9 @@
     <w:p>
       <w:pPr>
         <w:pStyle w:val="BodyText"/>
+        <w:spacing w:before="120" w:after="120"/>
+        <w:ind w:firstLine="0" w:left="0"/>
+        <w:jc w:val="center"/>
       </w:pPr>
       <m:oMath>
         <m:sSub>
@@ -4732,6 +4806,8 @@
     <w:p>
       <w:pPr>
         <w:pStyle w:val="BodyText"/>
+        <w:ind w:firstLine="0" w:left="0"/>
+        <w:jc w:val="left"/>
       </w:pPr>
       <w:r>
         <w:t xml:space="preserve">где</w:t>
@@ -4908,6 +4984,9 @@
     <w:p>
       <w:pPr>
         <w:pStyle w:val="BodyText"/>
+        <w:spacing w:before="120" w:after="120"/>
+        <w:ind w:firstLine="0" w:left="0"/>
+        <w:jc w:val="center"/>
       </w:pPr>
       <m:oMath>
         <m:sSub>
@@ -5171,8 +5250,16 @@
     <w:p>
       <w:pPr>
         <w:pStyle w:val="Heading1"/>
-      </w:pPr>
-      <w:r>
+        <w:ind w:firstLine="709" w:left="0"/>
+        <w:jc w:val="left"/>
+      </w:pPr>
+      <w:r>
+        <w:rPr>
+          <w:rFonts w:ascii="Times New Roman" w:hAnsi="Times New Roman"/>
+          <w:b/>
+          <w:i w:val="0"/>
+          <w:sz w:val="28"/>
+        </w:rPr>
         <w:t xml:space="preserve">2 Агентное и имитационное моделирование в экономике</w:t>
       </w:r>
     </w:p>
@@ -5180,8 +5267,16 @@
     <w:p>
       <w:pPr>
         <w:pStyle w:val="Heading2"/>
-      </w:pPr>
-      <w:r>
+        <w:ind w:firstLine="709" w:left="0"/>
+        <w:jc w:val="left"/>
+      </w:pPr>
+      <w:r>
+        <w:rPr>
+          <w:rFonts w:ascii="Times New Roman" w:hAnsi="Times New Roman"/>
+          <w:b/>
+          <w:i w:val="0"/>
+          <w:sz w:val="28"/>
+        </w:rPr>
         <w:t xml:space="preserve">2.1 Имитационное моделирование</w:t>
       </w:r>
     </w:p>
@@ -5211,68 +5306,56 @@
     </w:p>
     <w:p>
       <w:pPr>
-        <w:numPr>
-          <w:ilvl w:val="0"/>
-          <w:numId w:val="1003"/>
-        </w:numPr>
-      </w:pPr>
-      <w:r>
-        <w:t xml:space="preserve">математическое моделирование;</w:t>
-      </w:r>
-    </w:p>
-    <w:p>
-      <w:pPr>
-        <w:numPr>
-          <w:ilvl w:val="0"/>
-          <w:numId w:val="1003"/>
-        </w:numPr>
-      </w:pPr>
-      <w:r>
-        <w:t xml:space="preserve">компьютерное моделирование;</w:t>
-      </w:r>
-    </w:p>
-    <w:p>
-      <w:pPr>
-        <w:numPr>
-          <w:ilvl w:val="0"/>
-          <w:numId w:val="1003"/>
-        </w:numPr>
-      </w:pPr>
-      <w:r>
-        <w:t xml:space="preserve">логическое моделирование;</w:t>
-      </w:r>
-    </w:p>
-    <w:p>
-      <w:pPr>
-        <w:numPr>
-          <w:ilvl w:val="0"/>
-          <w:numId w:val="1003"/>
-        </w:numPr>
-      </w:pPr>
-      <w:r>
-        <w:t xml:space="preserve">физическое моделирование;</w:t>
-      </w:r>
-    </w:p>
-    <w:p>
-      <w:pPr>
-        <w:numPr>
-          <w:ilvl w:val="0"/>
-          <w:numId w:val="1003"/>
-        </w:numPr>
-      </w:pPr>
-      <w:r>
-        <w:t xml:space="preserve">имитационное моделирование;</w:t>
-      </w:r>
-    </w:p>
-    <w:p>
-      <w:pPr>
-        <w:numPr>
-          <w:ilvl w:val="0"/>
-          <w:numId w:val="1003"/>
-        </w:numPr>
-      </w:pPr>
-      <w:r>
-        <w:t xml:space="preserve">графическое моделирование и др.</w:t>
+        <w:spacing w:before="0" w:after="0"/>
+        <w:ind w:left="992" w:hanging="283"/>
+      </w:pPr>
+      <w:r>
+        <w:t>-- математическое моделирование;</w:t>
+      </w:r>
+    </w:p>
+    <w:p>
+      <w:pPr>
+        <w:spacing w:before="0" w:after="0"/>
+        <w:ind w:left="992" w:hanging="283"/>
+      </w:pPr>
+      <w:r>
+        <w:t>-- компьютерное моделирование;</w:t>
+      </w:r>
+    </w:p>
+    <w:p>
+      <w:pPr>
+        <w:spacing w:before="0" w:after="0"/>
+        <w:ind w:left="992" w:hanging="283"/>
+      </w:pPr>
+      <w:r>
+        <w:t>-- логическое моделирование;</w:t>
+      </w:r>
+    </w:p>
+    <w:p>
+      <w:pPr>
+        <w:spacing w:before="0" w:after="0"/>
+        <w:ind w:left="992" w:hanging="283"/>
+      </w:pPr>
+      <w:r>
+        <w:t>-- физическое моделирование;</w:t>
+      </w:r>
+    </w:p>
+    <w:p>
+      <w:pPr>
+        <w:spacing w:before="0" w:after="0"/>
+        <w:ind w:left="992" w:hanging="283"/>
+      </w:pPr>
+      <w:r>
+        <w:t>-- имитационное моделирование;</w:t>
+      </w:r>
+    </w:p>
+    <w:p>
+      <w:pPr>
+        <w:spacing w:before="0" w:after="0"/>
+        <w:ind w:left="992" w:hanging="283"/>
+      </w:pPr>
+      <w:r>
+        <w:t>-- графическое моделирование и др.</w:t>
       </w:r>
     </w:p>
     <w:p>
@@ -5317,68 +5400,56 @@
     </w:p>
     <w:p>
       <w:pPr>
-        <w:numPr>
-          <w:ilvl w:val="0"/>
-          <w:numId w:val="1004"/>
-        </w:numPr>
-      </w:pPr>
-      <w:r>
-        <w:t xml:space="preserve">для исследования поведения различных экономических субъектов (предприятий, отраслей, регионов и др.);</w:t>
-      </w:r>
-    </w:p>
-    <w:p>
-      <w:pPr>
-        <w:numPr>
-          <w:ilvl w:val="0"/>
-          <w:numId w:val="1004"/>
-        </w:numPr>
-      </w:pPr>
-      <w:r>
-        <w:t xml:space="preserve">поиска оптимальных стратегических и оперативных решений в различных организационных структурах;</w:t>
-      </w:r>
-    </w:p>
-    <w:p>
-      <w:pPr>
-        <w:numPr>
-          <w:ilvl w:val="0"/>
-          <w:numId w:val="1004"/>
-        </w:numPr>
-      </w:pPr>
-      <w:r>
-        <w:t xml:space="preserve">поддержки оптимального управления в сложных производственных системах (например, нефтеперерабатывающих заводов);</w:t>
-      </w:r>
-    </w:p>
-    <w:p>
-      <w:pPr>
-        <w:numPr>
-          <w:ilvl w:val="0"/>
-          <w:numId w:val="1004"/>
-        </w:numPr>
-      </w:pPr>
-      <w:r>
-        <w:t xml:space="preserve">поддержки проектирования высокотехнологичных динамических систем (например, самолетов, подводных лодок, систем связи и т. д.);</w:t>
-      </w:r>
-    </w:p>
-    <w:p>
-      <w:pPr>
-        <w:numPr>
-          <w:ilvl w:val="0"/>
-          <w:numId w:val="1004"/>
-        </w:numPr>
-      </w:pPr>
-      <w:r>
-        <w:t xml:space="preserve">изучения поведения социальных систем при различных сценарных условиях;</w:t>
-      </w:r>
-    </w:p>
-    <w:p>
-      <w:pPr>
-        <w:numPr>
-          <w:ilvl w:val="0"/>
-          <w:numId w:val="1004"/>
-        </w:numPr>
-      </w:pPr>
-      <w:r>
-        <w:t xml:space="preserve">исследования динамики распространения заболеваний, моделирования процессов в биологии, биоинженерии и здравоохранении.</w:t>
+        <w:spacing w:before="0" w:after="0"/>
+        <w:ind w:left="992" w:hanging="283"/>
+      </w:pPr>
+      <w:r>
+        <w:t>-- для исследования поведения различных экономических субъектов (предприятий, отраслей, регионов и др.);</w:t>
+      </w:r>
+    </w:p>
+    <w:p>
+      <w:pPr>
+        <w:spacing w:before="0" w:after="0"/>
+        <w:ind w:left="992" w:hanging="283"/>
+      </w:pPr>
+      <w:r>
+        <w:t>-- поиска оптимальных стратегических и оперативных решений в различных организационных структурах;</w:t>
+      </w:r>
+    </w:p>
+    <w:p>
+      <w:pPr>
+        <w:spacing w:before="0" w:after="0"/>
+        <w:ind w:left="992" w:hanging="283"/>
+      </w:pPr>
+      <w:r>
+        <w:t>-- поддержки оптимального управления в сложных производственных системах (например, нефтеперерабатывающих заводов);</w:t>
+      </w:r>
+    </w:p>
+    <w:p>
+      <w:pPr>
+        <w:spacing w:before="0" w:after="0"/>
+        <w:ind w:left="992" w:hanging="283"/>
+      </w:pPr>
+      <w:r>
+        <w:t>-- поддержки проектирования высокотехнологичных динамических систем (например, самолетов, подводных лодок, систем связи и т. д.);</w:t>
+      </w:r>
+    </w:p>
+    <w:p>
+      <w:pPr>
+        <w:spacing w:before="0" w:after="0"/>
+        <w:ind w:left="992" w:hanging="283"/>
+      </w:pPr>
+      <w:r>
+        <w:t>-- изучения поведения социальных систем при различных сценарных условиях;</w:t>
+      </w:r>
+    </w:p>
+    <w:p>
+      <w:pPr>
+        <w:spacing w:before="0" w:after="0"/>
+        <w:ind w:left="992" w:hanging="283"/>
+      </w:pPr>
+      <w:r>
+        <w:t>-- исследования динамики распространения заболеваний, моделирования процессов в биологии, биоинженерии и здравоохранении.</w:t>
       </w:r>
     </w:p>
     <w:p>
@@ -5510,79 +5581,65 @@
     </w:p>
     <w:p>
       <w:pPr>
-        <w:numPr>
-          <w:ilvl w:val="0"/>
-          <w:numId w:val="1005"/>
-        </w:numPr>
-      </w:pPr>
-      <w:r>
-        <w:t xml:space="preserve">анализ статистических данных (идентификация причинно-следственных связей);</w:t>
-      </w:r>
-    </w:p>
-    <w:p>
-      <w:pPr>
-        <w:numPr>
-          <w:ilvl w:val="0"/>
-          <w:numId w:val="1005"/>
-        </w:numPr>
-      </w:pPr>
-      <w:r>
-        <w:t xml:space="preserve">когнитивное моделирование (разработка карты причинно-следственных связей);</w:t>
-      </w:r>
-    </w:p>
-    <w:p>
-      <w:pPr>
-        <w:numPr>
-          <w:ilvl w:val="0"/>
-          <w:numId w:val="1005"/>
-        </w:numPr>
-      </w:pPr>
-      <w:r>
-        <w:t xml:space="preserve">разработка математической модели, представленной в виде динамической системы одновременных уравнений или расчет коэффициентов модели с использованием статистических пакетов;</w:t>
-      </w:r>
-    </w:p>
-    <w:p>
-      <w:pPr>
-        <w:numPr>
-          <w:ilvl w:val="0"/>
-          <w:numId w:val="1005"/>
-        </w:numPr>
-      </w:pPr>
-      <w:r>
-        <w:t xml:space="preserve">реализация математической модели на платформе имитационного моделирования, поддерживающей методы системной динамики;</w:t>
-      </w:r>
-    </w:p>
-    <w:p>
-      <w:pPr>
-        <w:numPr>
-          <w:ilvl w:val="0"/>
-          <w:numId w:val="1005"/>
-        </w:numPr>
-      </w:pPr>
-      <w:r>
-        <w:t xml:space="preserve">интеграция имитационной модели с источниками данных (например, базы данных);</w:t>
-      </w:r>
-    </w:p>
-    <w:p>
-      <w:pPr>
-        <w:numPr>
-          <w:ilvl w:val="0"/>
-          <w:numId w:val="1005"/>
-        </w:numPr>
-      </w:pPr>
-      <w:r>
-        <w:t xml:space="preserve">проведение численных экспериментов, а именно калибровка модели, верификация модели на исторических данных (подтверждение адекватности модели);</w:t>
-      </w:r>
-    </w:p>
-    <w:p>
-      <w:pPr>
-        <w:numPr>
-          <w:ilvl w:val="0"/>
-          <w:numId w:val="1005"/>
-        </w:numPr>
-      </w:pPr>
-      <w:r>
-        <w:t xml:space="preserve">поиск лучших управленческих, стратегических и оперативных решений с помощью системно-динамической имитационной модели.</w:t>
+        <w:spacing w:before="0" w:after="0"/>
+        <w:ind w:left="992" w:hanging="283"/>
+      </w:pPr>
+      <w:r>
+        <w:t>-- анализ статистических данных (идентификация причинно-следственных связей);</w:t>
+      </w:r>
+    </w:p>
+    <w:p>
+      <w:pPr>
+        <w:spacing w:before="0" w:after="0"/>
+        <w:ind w:left="992" w:hanging="283"/>
+      </w:pPr>
+      <w:r>
+        <w:t>-- когнитивное моделирование (разработка карты причинно-следственных связей);</w:t>
+      </w:r>
+    </w:p>
+    <w:p>
+      <w:pPr>
+        <w:spacing w:before="0" w:after="0"/>
+        <w:ind w:left="992" w:hanging="283"/>
+      </w:pPr>
+      <w:r>
+        <w:t>-- разработка математической модели, представленной в виде динамической системы одновременных уравнений или расчет коэффициентов модели с использованием статистических пакетов;</w:t>
+      </w:r>
+    </w:p>
+    <w:p>
+      <w:pPr>
+        <w:spacing w:before="0" w:after="0"/>
+        <w:ind w:left="992" w:hanging="283"/>
+      </w:pPr>
+      <w:r>
+        <w:t>-- реализация математической модели на платформе имитационного моделирования, поддерживающей методы системной динамики;</w:t>
+      </w:r>
+    </w:p>
+    <w:p>
+      <w:pPr>
+        <w:spacing w:before="0" w:after="0"/>
+        <w:ind w:left="992" w:hanging="283"/>
+      </w:pPr>
+      <w:r>
+        <w:t>-- интеграция имитационной модели с источниками данных (например, базы данных);</w:t>
+      </w:r>
+    </w:p>
+    <w:p>
+      <w:pPr>
+        <w:spacing w:before="0" w:after="0"/>
+        <w:ind w:left="992" w:hanging="283"/>
+      </w:pPr>
+      <w:r>
+        <w:t>-- проведение численных экспериментов, а именно калибровка модели, верификация модели на исторических данных (подтверждение адекватности модели);</w:t>
+      </w:r>
+    </w:p>
+    <w:p>
+      <w:pPr>
+        <w:spacing w:before="0" w:after="0"/>
+        <w:ind w:left="992" w:hanging="283"/>
+      </w:pPr>
+      <w:r>
+        <w:t>-- поиск лучших управленческих, стратегических и оперативных решений с помощью системно-динамической имитационной модели.</w:t>
       </w:r>
     </w:p>
     <w:p>
@@ -5638,8 +5695,16 @@
     <w:p>
       <w:pPr>
         <w:pStyle w:val="Heading2"/>
-      </w:pPr>
-      <w:r>
+        <w:ind w:firstLine="709" w:left="0"/>
+        <w:jc w:val="left"/>
+      </w:pPr>
+      <w:r>
+        <w:rPr>
+          <w:rFonts w:ascii="Times New Roman" w:hAnsi="Times New Roman"/>
+          <w:b/>
+          <w:i w:val="0"/>
+          <w:sz w:val="28"/>
+        </w:rPr>
         <w:t xml:space="preserve">2.2 Агентное моделирование</w:t>
       </w:r>
     </w:p>
@@ -5661,57 +5726,47 @@
     </w:p>
     <w:p>
       <w:pPr>
-        <w:numPr>
-          <w:ilvl w:val="0"/>
-          <w:numId w:val="1006"/>
-        </w:numPr>
-      </w:pPr>
-      <w:r>
-        <w:t xml:space="preserve">агент является «идентифицируемым», то есть представляет собой конечного индивидуума с набором определенных характеристик и правил, определяющих его поведение и правила принятия решений;</w:t>
-      </w:r>
-    </w:p>
-    <w:p>
-      <w:pPr>
-        <w:numPr>
-          <w:ilvl w:val="0"/>
-          <w:numId w:val="1006"/>
-        </w:numPr>
-      </w:pPr>
-      <w:r>
-        <w:t xml:space="preserve">агент автономен и может независимо действовать и принимать решения по взаимодействию с другими агентами;</w:t>
-      </w:r>
-    </w:p>
-    <w:p>
-      <w:pPr>
-        <w:numPr>
-          <w:ilvl w:val="0"/>
-          <w:numId w:val="1006"/>
-        </w:numPr>
-      </w:pPr>
-      <w:r>
-        <w:t xml:space="preserve">агент находится в определенной среде, позволяющей ему взаимодействовать с другими агентами, то есть агент может коммуницировать с другими (контактировать при определенных условиях и отвечать на контакт);</w:t>
-      </w:r>
-    </w:p>
-    <w:p>
-      <w:pPr>
-        <w:numPr>
-          <w:ilvl w:val="0"/>
-          <w:numId w:val="1006"/>
-        </w:numPr>
-      </w:pPr>
-      <w:r>
-        <w:t xml:space="preserve">агент имеет определенную цель (но не обязательно целью является максимизация блага, как принято считать в классической экономике), влияющую на его поведение;</w:t>
-      </w:r>
-    </w:p>
-    <w:p>
-      <w:pPr>
-        <w:numPr>
-          <w:ilvl w:val="0"/>
-          <w:numId w:val="1006"/>
-        </w:numPr>
-      </w:pPr>
-      <w:r>
-        <w:t xml:space="preserve">агент гибок и способен к самообучению, но в ряде случаев агент может даже изменять правила поведения на основе полученного опыта.</w:t>
+        <w:spacing w:before="0" w:after="0"/>
+        <w:ind w:left="992" w:hanging="283"/>
+      </w:pPr>
+      <w:r>
+        <w:t>-- агент является «идентифицируемым», то есть представляет собой конечного индивидуума с набором определенных характеристик и правил, определяющих его поведение и правила принятия решений;</w:t>
+      </w:r>
+    </w:p>
+    <w:p>
+      <w:pPr>
+        <w:spacing w:before="0" w:after="0"/>
+        <w:ind w:left="992" w:hanging="283"/>
+      </w:pPr>
+      <w:r>
+        <w:t>-- агент автономен и может независимо действовать и принимать решения по взаимодействию с другими агентами;</w:t>
+      </w:r>
+    </w:p>
+    <w:p>
+      <w:pPr>
+        <w:spacing w:before="0" w:after="0"/>
+        <w:ind w:left="992" w:hanging="283"/>
+      </w:pPr>
+      <w:r>
+        <w:t>-- агент находится в определенной среде, позволяющей ему взаимодействовать с другими агентами, то есть агент может коммуницировать с другими (контактировать при определенных условиях и отвечать на контакт);</w:t>
+      </w:r>
+    </w:p>
+    <w:p>
+      <w:pPr>
+        <w:spacing w:before="0" w:after="0"/>
+        <w:ind w:left="992" w:hanging="283"/>
+      </w:pPr>
+      <w:r>
+        <w:t>-- агент имеет определенную цель (но не обязательно целью является максимизация блага, как принято считать в классической экономике), влияющую на его поведение;</w:t>
+      </w:r>
+    </w:p>
+    <w:p>
+      <w:pPr>
+        <w:spacing w:before="0" w:after="0"/>
+        <w:ind w:left="992" w:hanging="283"/>
+      </w:pPr>
+      <w:r>
+        <w:t>-- агент гибок и способен к самообучению, но в ряде случаев агент может даже изменять правила поведения на основе полученного опыта.</w:t>
       </w:r>
     </w:p>
     <w:p>
@@ -5803,35 +5858,29 @@
     </w:p>
     <w:p>
       <w:pPr>
-        <w:numPr>
-          <w:ilvl w:val="0"/>
-          <w:numId w:val="1007"/>
-        </w:numPr>
-      </w:pPr>
-      <w:r>
-        <w:t xml:space="preserve">семантическое распределение (агенты образуют кластеры или объединения, разделенные между собой разными характеристиками и правилами принятия решений);</w:t>
-      </w:r>
-    </w:p>
-    <w:p>
-      <w:pPr>
-        <w:numPr>
-          <w:ilvl w:val="0"/>
-          <w:numId w:val="1007"/>
-        </w:numPr>
-      </w:pPr>
-      <w:r>
-        <w:t xml:space="preserve">пространственное распределение (например, географическое распределение, вносимое в многоагентную систему для моделирования территориально распределенных систем, где у каждой территории свои свойства и своя специфика, воздействующая на агентов);</w:t>
-      </w:r>
-    </w:p>
-    <w:p>
-      <w:pPr>
-        <w:numPr>
-          <w:ilvl w:val="0"/>
-          <w:numId w:val="1007"/>
-        </w:numPr>
-      </w:pPr>
-      <w:r>
-        <w:t xml:space="preserve">временное распределение (например, в общем случае агенты могут рождаться и умирать в системе в произвольные моменты времени, или в соответствии с введенными в систему закономерностями).</w:t>
+        <w:spacing w:before="0" w:after="0"/>
+        <w:ind w:left="992" w:hanging="283"/>
+      </w:pPr>
+      <w:r>
+        <w:t>-- семантическое распределение (агенты образуют кластеры или объединения, разделенные между собой разными характеристиками и правилами принятия решений);</w:t>
+      </w:r>
+    </w:p>
+    <w:p>
+      <w:pPr>
+        <w:spacing w:before="0" w:after="0"/>
+        <w:ind w:left="992" w:hanging="283"/>
+      </w:pPr>
+      <w:r>
+        <w:t>-- пространственное распределение (например, географическое распределение, вносимое в многоагентную систему для моделирования территориально распределенных систем, где у каждой территории свои свойства и своя специфика, воздействующая на агентов);</w:t>
+      </w:r>
+    </w:p>
+    <w:p>
+      <w:pPr>
+        <w:spacing w:before="0" w:after="0"/>
+        <w:ind w:left="992" w:hanging="283"/>
+      </w:pPr>
+      <w:r>
+        <w:t>-- временное распределение (например, в общем случае агенты могут рождаться и умирать в системе в произвольные моменты времени, или в соответствии с введенными в систему закономерностями).</w:t>
       </w:r>
     </w:p>
     <w:p>
@@ -5990,8 +6039,16 @@
     <w:p>
       <w:pPr>
         <w:pStyle w:val="Heading2"/>
-      </w:pPr>
-      <w:r>
+        <w:ind w:firstLine="709" w:left="0"/>
+        <w:jc w:val="left"/>
+      </w:pPr>
+      <w:r>
+        <w:rPr>
+          <w:rFonts w:ascii="Times New Roman" w:hAnsi="Times New Roman"/>
+          <w:b/>
+          <w:i w:val="0"/>
+          <w:sz w:val="28"/>
+        </w:rPr>
         <w:t xml:space="preserve">2.3 Применение агентного подхода в экономике</w:t>
       </w:r>
     </w:p>
@@ -6040,8 +6097,16 @@
     <w:p>
       <w:pPr>
         <w:pStyle w:val="Heading2"/>
-      </w:pPr>
-      <w:r>
+        <w:ind w:firstLine="709" w:left="0"/>
+        <w:jc w:val="left"/>
+      </w:pPr>
+      <w:r>
+        <w:rPr>
+          <w:rFonts w:ascii="Times New Roman" w:hAnsi="Times New Roman"/>
+          <w:b/>
+          <w:i w:val="0"/>
+          <w:sz w:val="28"/>
+        </w:rPr>
         <w:t xml:space="preserve">2.4 Обзор существующих моделей</w:t>
       </w:r>
     </w:p>
@@ -6217,8 +6282,16 @@
     <w:p>
       <w:pPr>
         <w:pStyle w:val="Heading2"/>
-      </w:pPr>
-      <w:r>
+        <w:ind w:firstLine="709" w:left="0"/>
+        <w:jc w:val="left"/>
+      </w:pPr>
+      <w:r>
+        <w:rPr>
+          <w:rFonts w:ascii="Times New Roman" w:hAnsi="Times New Roman"/>
+          <w:b/>
+          <w:i w:val="0"/>
+          <w:sz w:val="28"/>
+        </w:rPr>
         <w:t xml:space="preserve">2.5 Обоснование интеграции МОБ и АБМ</w:t>
       </w:r>
     </w:p>
@@ -6491,8 +6564,16 @@
     <w:p>
       <w:pPr>
         <w:pStyle w:val="Heading1"/>
-      </w:pPr>
-      <w:r>
+        <w:ind w:firstLine="709" w:left="0"/>
+        <w:jc w:val="left"/>
+      </w:pPr>
+      <w:r>
+        <w:rPr>
+          <w:rFonts w:ascii="Times New Roman" w:hAnsi="Times New Roman"/>
+          <w:b/>
+          <w:i w:val="0"/>
+          <w:sz w:val="28"/>
+        </w:rPr>
         <w:t xml:space="preserve">3 Агентно-ориентированная модель внутриотраслевых процессов</w:t>
       </w:r>
     </w:p>
@@ -6500,8 +6581,16 @@
     <w:p>
       <w:pPr>
         <w:pStyle w:val="Heading2"/>
-      </w:pPr>
-      <w:r>
+        <w:ind w:firstLine="709" w:left="0"/>
+        <w:jc w:val="left"/>
+      </w:pPr>
+      <w:r>
+        <w:rPr>
+          <w:rFonts w:ascii="Times New Roman" w:hAnsi="Times New Roman"/>
+          <w:b/>
+          <w:i w:val="0"/>
+          <w:sz w:val="28"/>
+        </w:rPr>
         <w:t xml:space="preserve">3.1 Фирма как базовый агент внутри отрасли</w:t>
       </w:r>
     </w:p>
@@ -6624,6 +6713,8 @@
     <w:p>
       <w:pPr>
         <w:pStyle w:val="FirstParagraph"/>
+        <w:ind w:firstLine="0" w:left="0"/>
+        <w:jc w:val="left"/>
       </w:pPr>
       <w:r>
         <w:t xml:space="preserve">где</w:t>
@@ -7106,6 +7197,8 @@
     <w:p>
       <w:pPr>
         <w:pStyle w:val="FirstParagraph"/>
+        <w:ind w:firstLine="0" w:left="0"/>
+        <w:jc w:val="left"/>
       </w:pPr>
       <w:r>
         <w:t xml:space="preserve">где</w:t>
@@ -7634,6 +7727,8 @@
     <w:p>
       <w:pPr>
         <w:pStyle w:val="FirstParagraph"/>
+        <w:ind w:firstLine="0" w:left="0"/>
+        <w:jc w:val="left"/>
       </w:pPr>
       <w:r>
         <w:t xml:space="preserve">где</w:t>
@@ -7689,35 +7784,29 @@
     </w:p>
     <w:p>
       <w:pPr>
-        <w:numPr>
-          <w:ilvl w:val="0"/>
-          <w:numId w:val="1008"/>
-        </w:numPr>
-      </w:pPr>
-      <w:r>
-        <w:t xml:space="preserve">правила краткосрочного планирования выпуска;</w:t>
-      </w:r>
-    </w:p>
-    <w:p>
-      <w:pPr>
-        <w:numPr>
-          <w:ilvl w:val="0"/>
-          <w:numId w:val="1008"/>
-        </w:numPr>
-      </w:pPr>
-      <w:r>
-        <w:t xml:space="preserve">правила формирования спроса на промежуточные ресурсы;</w:t>
-      </w:r>
-    </w:p>
-    <w:p>
-      <w:pPr>
-        <w:numPr>
-          <w:ilvl w:val="0"/>
-          <w:numId w:val="1008"/>
-        </w:numPr>
-      </w:pPr>
-      <w:r>
-        <w:t xml:space="preserve">правила инвестиционного поведения и обновления капитала.</w:t>
+        <w:spacing w:before="0" w:after="0"/>
+        <w:ind w:left="992" w:hanging="283"/>
+      </w:pPr>
+      <w:r>
+        <w:t>-- правила краткосрочного планирования выпуска;</w:t>
+      </w:r>
+    </w:p>
+    <w:p>
+      <w:pPr>
+        <w:spacing w:before="0" w:after="0"/>
+        <w:ind w:left="992" w:hanging="283"/>
+      </w:pPr>
+      <w:r>
+        <w:t>-- правила формирования спроса на промежуточные ресурсы;</w:t>
+      </w:r>
+    </w:p>
+    <w:p>
+      <w:pPr>
+        <w:spacing w:before="0" w:after="0"/>
+        <w:ind w:left="992" w:hanging="283"/>
+      </w:pPr>
+      <w:r>
+        <w:t>-- правила инвестиционного поведения и обновления капитала.</w:t>
       </w:r>
     </w:p>
     <w:p>
@@ -7814,8 +7903,16 @@
     <w:p>
       <w:pPr>
         <w:pStyle w:val="Heading2"/>
-      </w:pPr>
-      <w:r>
+        <w:ind w:firstLine="709" w:left="0"/>
+        <w:jc w:val="left"/>
+      </w:pPr>
+      <w:r>
+        <w:rPr>
+          <w:rFonts w:ascii="Times New Roman" w:hAnsi="Times New Roman"/>
+          <w:b/>
+          <w:i w:val="0"/>
+          <w:sz w:val="28"/>
+        </w:rPr>
         <w:t xml:space="preserve">3.2 Формирование матрицы прямых затрат</w:t>
       </w:r>
     </w:p>
@@ -8681,6 +8778,8 @@
     <w:p>
       <w:pPr>
         <w:pStyle w:val="FirstParagraph"/>
+        <w:ind w:firstLine="0" w:left="0"/>
+        <w:jc w:val="left"/>
       </w:pPr>
       <w:r>
         <w:t xml:space="preserve">где</w:t>
@@ -9207,6 +9306,8 @@
     <w:p>
       <w:pPr>
         <w:pStyle w:val="FirstParagraph"/>
+        <w:ind w:firstLine="0" w:left="0"/>
+        <w:jc w:val="left"/>
       </w:pPr>
       <w:r>
         <w:t xml:space="preserve">где</w:t>
@@ -9267,8 +9368,16 @@
     <w:p>
       <w:pPr>
         <w:pStyle w:val="Heading2"/>
-      </w:pPr>
-      <w:r>
+        <w:ind w:firstLine="709" w:left="0"/>
+        <w:jc w:val="left"/>
+      </w:pPr>
+      <w:r>
+        <w:rPr>
+          <w:rFonts w:ascii="Times New Roman" w:hAnsi="Times New Roman"/>
+          <w:b/>
+          <w:i w:val="0"/>
+          <w:sz w:val="28"/>
+        </w:rPr>
         <w:t xml:space="preserve">3.3 Инвестиционное поведение и матрица капиталоемкости</w:t>
       </w:r>
     </w:p>
@@ -9898,6 +10007,8 @@
     <w:p>
       <w:pPr>
         <w:pStyle w:val="FirstParagraph"/>
+        <w:ind w:firstLine="0" w:left="0"/>
+        <w:jc w:val="left"/>
       </w:pPr>
       <w:r>
         <w:t xml:space="preserve">где</w:t>
@@ -10139,6 +10250,8 @@
     <w:p>
       <w:pPr>
         <w:pStyle w:val="FirstParagraph"/>
+        <w:ind w:firstLine="0" w:left="0"/>
+        <w:jc w:val="left"/>
       </w:pPr>
       <w:r>
         <w:t xml:space="preserve">где</w:t>
@@ -10275,8 +10388,16 @@
     <w:p>
       <w:pPr>
         <w:pStyle w:val="Heading2"/>
-      </w:pPr>
-      <w:r>
+        <w:ind w:firstLine="709" w:left="0"/>
+        <w:jc w:val="left"/>
+      </w:pPr>
+      <w:r>
+        <w:rPr>
+          <w:rFonts w:ascii="Times New Roman" w:hAnsi="Times New Roman"/>
+          <w:b/>
+          <w:i w:val="0"/>
+          <w:sz w:val="28"/>
+        </w:rPr>
         <w:t xml:space="preserve">3.4 Формирование конечного спроса</w:t>
       </w:r>
     </w:p>
@@ -10463,6 +10584,8 @@
     <w:p>
       <w:pPr>
         <w:pStyle w:val="FirstParagraph"/>
+        <w:ind w:firstLine="0" w:left="0"/>
+        <w:jc w:val="left"/>
       </w:pPr>
       <w:r>
         <w:t xml:space="preserve">где</w:t>
@@ -11052,8 +11175,16 @@
     <w:p>
       <w:pPr>
         <w:pStyle w:val="Heading2"/>
-      </w:pPr>
-      <w:r>
+        <w:ind w:firstLine="709" w:left="0"/>
+        <w:jc w:val="left"/>
+      </w:pPr>
+      <w:r>
+        <w:rPr>
+          <w:rFonts w:ascii="Times New Roman" w:hAnsi="Times New Roman"/>
+          <w:b/>
+          <w:i w:val="0"/>
+          <w:sz w:val="28"/>
+        </w:rPr>
         <w:t xml:space="preserve">3.5 Условия корректности агентного моделирования</w:t>
       </w:r>
     </w:p>
@@ -11190,6 +11321,8 @@
     <w:p>
       <w:pPr>
         <w:pStyle w:val="FirstParagraph"/>
+        <w:ind w:firstLine="0" w:left="0"/>
+        <w:jc w:val="left"/>
       </w:pPr>
       <w:r>
         <w:t xml:space="preserve">где</w:t>
@@ -12054,24 +12187,20 @@
     </w:p>
     <w:p>
       <w:pPr>
-        <w:numPr>
-          <w:ilvl w:val="0"/>
-          <w:numId w:val="1009"/>
-        </w:numPr>
-      </w:pPr>
-      <w:r>
-        <w:t xml:space="preserve">проверку знаков всех выпусков и инвестиций;</w:t>
-      </w:r>
-    </w:p>
-    <w:p>
-      <w:pPr>
-        <w:numPr>
-          <w:ilvl w:val="0"/>
-          <w:numId w:val="1009"/>
-        </w:numPr>
-      </w:pPr>
-      <w:r>
-        <w:t xml:space="preserve">проверку продуктивности</w:t>
+        <w:spacing w:before="0" w:after="0"/>
+        <w:ind w:left="992" w:hanging="283"/>
+      </w:pPr>
+      <w:r>
+        <w:t>-- проверку знаков всех выпусков и инвестиций;</w:t>
+      </w:r>
+    </w:p>
+    <w:p>
+      <w:pPr>
+        <w:spacing w:before="0" w:after="0"/>
+        <w:ind w:left="992" w:hanging="283"/>
+      </w:pPr>
+      <w:r>
+        <w:t>-- проверку продуктивности</w:t>
       </w:r>
       <w:r>
         <w:t xml:space="preserve"> </w:t>
@@ -12102,13 +12231,11 @@
     </w:p>
     <w:p>
       <w:pPr>
-        <w:numPr>
-          <w:ilvl w:val="0"/>
-          <w:numId w:val="1009"/>
-        </w:numPr>
-      </w:pPr>
-      <w:r>
-        <w:t xml:space="preserve">проверку допустимости матрицы</w:t>
+        <w:spacing w:before="0" w:after="0"/>
+        <w:ind w:left="992" w:hanging="283"/>
+      </w:pPr>
+      <w:r>
+        <w:t>-- проверку допустимости матрицы</w:t>
       </w:r>
       <w:r>
         <w:t xml:space="preserve"> </w:t>
@@ -12142,13 +12269,11 @@
     </w:p>
     <w:p>
       <w:pPr>
-        <w:numPr>
-          <w:ilvl w:val="0"/>
-          <w:numId w:val="1009"/>
-        </w:numPr>
-      </w:pPr>
-      <w:r>
-        <w:t xml:space="preserve">контроль устойчивости численного решения динамического уравнения.</w:t>
+        <w:spacing w:before="0" w:after="0"/>
+        <w:ind w:left="992" w:hanging="283"/>
+      </w:pPr>
+      <w:r>
+        <w:t>-- контроль устойчивости численного решения динамического уравнения.</w:t>
       </w:r>
     </w:p>
     <w:p>
@@ -12164,8 +12289,16 @@
     <w:p>
       <w:pPr>
         <w:pStyle w:val="Heading2"/>
-      </w:pPr>
-      <w:r>
+        <w:ind w:firstLine="709" w:left="0"/>
+        <w:jc w:val="left"/>
+      </w:pPr>
+      <w:r>
+        <w:rPr>
+          <w:rFonts w:ascii="Times New Roman" w:hAnsi="Times New Roman"/>
+          <w:b/>
+          <w:i w:val="0"/>
+          <w:sz w:val="28"/>
+        </w:rPr>
         <w:t xml:space="preserve">3.6 Алгоритм интеграции агентов в МОБ</w:t>
       </w:r>
     </w:p>
@@ -13303,8 +13436,16 @@
     <w:p>
       <w:pPr>
         <w:pStyle w:val="Heading1"/>
-      </w:pPr>
-      <w:r>
+        <w:ind w:firstLine="709" w:left="0"/>
+        <w:jc w:val="left"/>
+      </w:pPr>
+      <w:r>
+        <w:rPr>
+          <w:rFonts w:ascii="Times New Roman" w:hAnsi="Times New Roman"/>
+          <w:b/>
+          <w:i w:val="0"/>
+          <w:sz w:val="28"/>
+        </w:rPr>
         <w:t xml:space="preserve">4 Математическая модель экономики с 5 отраслями</w:t>
       </w:r>
     </w:p>
@@ -13378,8 +13519,16 @@
     <w:p>
       <w:pPr>
         <w:pStyle w:val="Heading2"/>
-      </w:pPr>
-      <w:r>
+        <w:ind w:firstLine="709" w:left="0"/>
+        <w:jc w:val="left"/>
+      </w:pPr>
+      <w:r>
+        <w:rPr>
+          <w:rFonts w:ascii="Times New Roman" w:hAnsi="Times New Roman"/>
+          <w:b/>
+          <w:i w:val="0"/>
+          <w:sz w:val="28"/>
+        </w:rPr>
         <w:t xml:space="preserve">4.1 Отраслевой состав модели и выбор числа агентов</w:t>
       </w:r>
     </w:p>
@@ -13648,13 +13797,11 @@
     </w:p>
     <w:p>
       <w:pPr>
-        <w:numPr>
-          <w:ilvl w:val="0"/>
-          <w:numId w:val="1010"/>
-        </w:numPr>
-      </w:pPr>
-      <w:r>
-        <w:t xml:space="preserve">Добывающая промышленность,</w:t>
+        <w:spacing w:before="0" w:after="0"/>
+        <w:ind w:left="992" w:hanging="283"/>
+      </w:pPr>
+      <w:r>
+        <w:t>-- Добывающая промышленность,</w:t>
       </w:r>
       <w:r>
         <w:t xml:space="preserve"> </w:t>
@@ -13688,13 +13835,11 @@
     </w:p>
     <w:p>
       <w:pPr>
-        <w:numPr>
-          <w:ilvl w:val="0"/>
-          <w:numId w:val="1010"/>
-        </w:numPr>
-      </w:pPr>
-      <w:r>
-        <w:t xml:space="preserve">Электроэнергетика,</w:t>
+        <w:spacing w:before="0" w:after="0"/>
+        <w:ind w:left="992" w:hanging="283"/>
+      </w:pPr>
+      <w:r>
+        <w:t>-- Электроэнергетика,</w:t>
       </w:r>
       <w:r>
         <w:t xml:space="preserve"> </w:t>
@@ -13728,13 +13873,11 @@
     </w:p>
     <w:p>
       <w:pPr>
-        <w:numPr>
-          <w:ilvl w:val="0"/>
-          <w:numId w:val="1010"/>
-        </w:numPr>
-      </w:pPr>
-      <w:r>
-        <w:t xml:space="preserve">Обрабатывающая промышленность,</w:t>
+        <w:spacing w:before="0" w:after="0"/>
+        <w:ind w:left="992" w:hanging="283"/>
+      </w:pPr>
+      <w:r>
+        <w:t>-- Обрабатывающая промышленность,</w:t>
       </w:r>
       <w:r>
         <w:t xml:space="preserve"> </w:t>
@@ -13768,13 +13911,11 @@
     </w:p>
     <w:p>
       <w:pPr>
-        <w:numPr>
-          <w:ilvl w:val="0"/>
-          <w:numId w:val="1010"/>
-        </w:numPr>
-      </w:pPr>
-      <w:r>
-        <w:t xml:space="preserve">Строительство,</w:t>
+        <w:spacing w:before="0" w:after="0"/>
+        <w:ind w:left="992" w:hanging="283"/>
+      </w:pPr>
+      <w:r>
+        <w:t>-- Строительство,</w:t>
       </w:r>
       <w:r>
         <w:t xml:space="preserve"> </w:t>
@@ -13834,13 +13975,11 @@
     </w:p>
     <w:p>
       <w:pPr>
-        <w:numPr>
-          <w:ilvl w:val="0"/>
-          <w:numId w:val="1010"/>
-        </w:numPr>
-      </w:pPr>
-      <w:r>
-        <w:t xml:space="preserve">Сельское хозяйство,</w:t>
+        <w:spacing w:before="0" w:after="0"/>
+        <w:ind w:left="992" w:hanging="283"/>
+      </w:pPr>
+      <w:r>
+        <w:t>-- Сельское хозяйство,</w:t>
       </w:r>
       <w:r>
         <w:t xml:space="preserve"> </w:t>
@@ -14429,8 +14568,16 @@
     <w:p>
       <w:pPr>
         <w:pStyle w:val="Heading2"/>
-      </w:pPr>
-      <w:r>
+        <w:ind w:firstLine="709" w:left="0"/>
+        <w:jc w:val="left"/>
+      </w:pPr>
+      <w:r>
+        <w:rPr>
+          <w:rFonts w:ascii="Times New Roman" w:hAnsi="Times New Roman"/>
+          <w:b/>
+          <w:i w:val="0"/>
+          <w:sz w:val="28"/>
+        </w:rPr>
         <w:t xml:space="preserve">4.2 Основные предпосылки и временная структура</w:t>
       </w:r>
     </w:p>
@@ -14703,13 +14850,11 @@
     </w:p>
     <w:p>
       <w:pPr>
-        <w:numPr>
-          <w:ilvl w:val="0"/>
-          <w:numId w:val="1011"/>
-        </w:numPr>
-      </w:pPr>
-      <w:r>
-        <w:t xml:space="preserve">Цены</w:t>
+        <w:spacing w:before="0" w:after="0"/>
+        <w:ind w:left="992" w:hanging="283"/>
+      </w:pPr>
+      <w:r>
+        <w:t>-- Цены</w:t>
       </w:r>
       <w:r>
         <w:t xml:space="preserve"> </w:t>
@@ -14752,46 +14897,38 @@
     </w:p>
     <w:p>
       <w:pPr>
-        <w:numPr>
-          <w:ilvl w:val="0"/>
-          <w:numId w:val="1011"/>
-        </w:numPr>
-      </w:pPr>
-      <w:r>
-        <w:t xml:space="preserve">Каждая фирма характеризуется ограниченной рациональностью: она не решает глобальную оптимизационную задачу, а реагирует на наблюдаемый спрос, прибыль, дефицит мощностей и собственное технологическое состояние;</w:t>
-      </w:r>
-    </w:p>
-    <w:p>
-      <w:pPr>
-        <w:numPr>
-          <w:ilvl w:val="0"/>
-          <w:numId w:val="1011"/>
-        </w:numPr>
-      </w:pPr>
-      <w:r>
-        <w:t xml:space="preserve">Выпуск фирмы ограничен как ожидаемым спросом, так и производственной мощностью, определяемой капиталом и эффективностью его использования;</w:t>
-      </w:r>
-    </w:p>
-    <w:p>
-      <w:pPr>
-        <w:numPr>
-          <w:ilvl w:val="0"/>
-          <w:numId w:val="1011"/>
-        </w:numPr>
-      </w:pPr>
-      <w:r>
-        <w:t xml:space="preserve">Инвестиции имеют двойственную природу: часть инвестиций определяется прибылью, а часть – необходимостью расширения мощностей при превышении спроса над текущим выпуском;</w:t>
-      </w:r>
-    </w:p>
-    <w:p>
-      <w:pPr>
-        <w:numPr>
-          <w:ilvl w:val="0"/>
-          <w:numId w:val="1011"/>
-        </w:numPr>
-      </w:pPr>
-      <w:r>
-        <w:t xml:space="preserve">Агрегированные коэффициенты прямых затрат и капиталоемкости пересчитываются на каждом шаге моделирования и потому являются эндогенными переменными модели.</w:t>
+        <w:spacing w:before="0" w:after="0"/>
+        <w:ind w:left="992" w:hanging="283"/>
+      </w:pPr>
+      <w:r>
+        <w:t>-- Каждая фирма характеризуется ограниченной рациональностью: она не решает глобальную оптимизационную задачу, а реагирует на наблюдаемый спрос, прибыль, дефицит мощностей и собственное технологическое состояние;</w:t>
+      </w:r>
+    </w:p>
+    <w:p>
+      <w:pPr>
+        <w:spacing w:before="0" w:after="0"/>
+        <w:ind w:left="992" w:hanging="283"/>
+      </w:pPr>
+      <w:r>
+        <w:t>-- Выпуск фирмы ограничен как ожидаемым спросом, так и производственной мощностью, определяемой капиталом и эффективностью его использования;</w:t>
+      </w:r>
+    </w:p>
+    <w:p>
+      <w:pPr>
+        <w:spacing w:before="0" w:after="0"/>
+        <w:ind w:left="992" w:hanging="283"/>
+      </w:pPr>
+      <w:r>
+        <w:t>-- Инвестиции имеют двойственную природу: часть инвестиций определяется прибылью, а часть – необходимостью расширения мощностей при превышении спроса над текущим выпуском;</w:t>
+      </w:r>
+    </w:p>
+    <w:p>
+      <w:pPr>
+        <w:spacing w:before="0" w:after="0"/>
+        <w:ind w:left="992" w:hanging="283"/>
+      </w:pPr>
+      <w:r>
+        <w:t>-- Агрегированные коэффициенты прямых затрат и капиталоемкости пересчитываются на каждом шаге моделирования и потому являются эндогенными переменными модели.</w:t>
       </w:r>
     </w:p>
     <w:bookmarkEnd w:id="38"/>
@@ -14799,8 +14936,16 @@
     <w:p>
       <w:pPr>
         <w:pStyle w:val="Heading2"/>
-      </w:pPr>
-      <w:r>
+        <w:ind w:firstLine="709" w:left="0"/>
+        <w:jc w:val="left"/>
+      </w:pPr>
+      <w:r>
+        <w:rPr>
+          <w:rFonts w:ascii="Times New Roman" w:hAnsi="Times New Roman"/>
+          <w:b/>
+          <w:i w:val="0"/>
+          <w:sz w:val="28"/>
+        </w:rPr>
         <w:t xml:space="preserve">4.3 Макроуровень. Динамический межотраслевой баланс</w:t>
       </w:r>
     </w:p>
@@ -15050,6 +15195,8 @@
     <w:p>
       <w:pPr>
         <w:pStyle w:val="FirstParagraph"/>
+        <w:ind w:firstLine="0" w:left="0"/>
+        <w:jc w:val="left"/>
       </w:pPr>
       <w:r>
         <w:t xml:space="preserve">где</w:t>
@@ -17224,6 +17371,8 @@
     <w:p>
       <w:pPr>
         <w:pStyle w:val="FirstParagraph"/>
+        <w:ind w:firstLine="0" w:left="0"/>
+        <w:jc w:val="left"/>
       </w:pPr>
       <w:r>
         <w:t xml:space="preserve">где</w:t>
@@ -17549,8 +17698,16 @@
     <w:p>
       <w:pPr>
         <w:pStyle w:val="Heading2"/>
-      </w:pPr>
-      <w:r>
+        <w:ind w:firstLine="709" w:left="0"/>
+        <w:jc w:val="left"/>
+      </w:pPr>
+      <w:r>
+        <w:rPr>
+          <w:rFonts w:ascii="Times New Roman" w:hAnsi="Times New Roman"/>
+          <w:b/>
+          <w:i w:val="0"/>
+          <w:sz w:val="28"/>
+        </w:rPr>
         <w:t xml:space="preserve">4.4 Микроуровень. Фирма как агент</w:t>
       </w:r>
     </w:p>
@@ -17893,6 +18050,8 @@
     <w:p>
       <w:pPr>
         <w:pStyle w:val="FirstParagraph"/>
+        <w:ind w:firstLine="0" w:left="0"/>
+        <w:jc w:val="left"/>
       </w:pPr>
       <w:r>
         <w:t xml:space="preserve">где</w:t>
@@ -18654,6 +18813,8 @@
     <w:p>
       <w:pPr>
         <w:pStyle w:val="FirstParagraph"/>
+        <w:ind w:firstLine="0" w:left="0"/>
+        <w:jc w:val="left"/>
       </w:pPr>
       <w:r>
         <w:t xml:space="preserve">где границы интервала отражают отраслевую неоднородность технологий. Для добывающей промышленности и электроэнергетики этот интервал может быть уже, чем для обработки и сельского хозяйства, где различия между фирмами обычно выше.</w:t>
@@ -19192,6 +19353,8 @@
     <w:p>
       <w:pPr>
         <w:pStyle w:val="FirstParagraph"/>
+        <w:ind w:firstLine="0" w:left="0"/>
+        <w:jc w:val="left"/>
       </w:pPr>
       <w:r>
         <w:t xml:space="preserve">где</w:t>
@@ -19234,8 +19397,16 @@
     <w:p>
       <w:pPr>
         <w:pStyle w:val="Heading2"/>
-      </w:pPr>
-      <w:r>
+        <w:ind w:firstLine="709" w:left="0"/>
+        <w:jc w:val="left"/>
+      </w:pPr>
+      <w:r>
+        <w:rPr>
+          <w:rFonts w:ascii="Times New Roman" w:hAnsi="Times New Roman"/>
+          <w:b/>
+          <w:i w:val="0"/>
+          <w:sz w:val="28"/>
+        </w:rPr>
         <w:t xml:space="preserve">4.5 Уравнения фирм</w:t>
       </w:r>
     </w:p>
@@ -20096,6 +20267,8 @@
     <w:p>
       <w:pPr>
         <w:pStyle w:val="FirstParagraph"/>
+        <w:ind w:firstLine="0" w:left="0"/>
+        <w:jc w:val="left"/>
       </w:pPr>
       <w:r>
         <w:t xml:space="preserve">где</w:t>
@@ -21174,6 +21347,8 @@
     <w:p>
       <w:pPr>
         <w:pStyle w:val="FirstParagraph"/>
+        <w:ind w:firstLine="0" w:left="0"/>
+        <w:jc w:val="left"/>
       </w:pPr>
       <w:r>
         <w:t xml:space="preserve">где</w:t>
@@ -21511,6 +21686,8 @@
     <w:p>
       <w:pPr>
         <w:pStyle w:val="FirstParagraph"/>
+        <w:ind w:firstLine="0" w:left="0"/>
+        <w:jc w:val="left"/>
       </w:pPr>
       <w:r>
         <w:t xml:space="preserve">где</w:t>
@@ -22231,6 +22408,8 @@
     <w:p>
       <w:pPr>
         <w:pStyle w:val="FirstParagraph"/>
+        <w:ind w:firstLine="0" w:left="0"/>
+        <w:jc w:val="left"/>
       </w:pPr>
       <w:r>
         <w:t xml:space="preserve">где</w:t>
@@ -22907,8 +23086,16 @@
     <w:p>
       <w:pPr>
         <w:pStyle w:val="Heading2"/>
-      </w:pPr>
-      <w:r>
+        <w:ind w:firstLine="709" w:left="0"/>
+        <w:jc w:val="left"/>
+      </w:pPr>
+      <w:r>
+        <w:rPr>
+          <w:rFonts w:ascii="Times New Roman" w:hAnsi="Times New Roman"/>
+          <w:b/>
+          <w:i w:val="0"/>
+          <w:sz w:val="28"/>
+        </w:rPr>
         <w:t xml:space="preserve">4.6 Переход от микроуровня к макроуровню</w:t>
       </w:r>
     </w:p>
@@ -24212,6 +24399,8 @@
     <w:p>
       <w:pPr>
         <w:pStyle w:val="FirstParagraph"/>
+        <w:ind w:firstLine="0" w:left="0"/>
+        <w:jc w:val="left"/>
       </w:pPr>
       <w:r>
         <w:t xml:space="preserve">где</w:t>
@@ -24892,8 +25081,16 @@
     <w:p>
       <w:pPr>
         <w:pStyle w:val="Heading2"/>
-      </w:pPr>
-      <w:r>
+        <w:ind w:firstLine="709" w:left="0"/>
+        <w:jc w:val="left"/>
+      </w:pPr>
+      <w:r>
+        <w:rPr>
+          <w:rFonts w:ascii="Times New Roman" w:hAnsi="Times New Roman"/>
+          <w:b/>
+          <w:i w:val="0"/>
+          <w:sz w:val="28"/>
+        </w:rPr>
         <w:t xml:space="preserve">4.7 Условия корректности и допустимости модели</w:t>
       </w:r>
     </w:p>
@@ -26490,8 +26687,16 @@
     <w:p>
       <w:pPr>
         <w:pStyle w:val="Heading1"/>
-      </w:pPr>
-      <w:r>
+        <w:ind w:firstLine="709" w:left="0"/>
+        <w:jc w:val="left"/>
+      </w:pPr>
+      <w:r>
+        <w:rPr>
+          <w:rFonts w:ascii="Times New Roman" w:hAnsi="Times New Roman"/>
+          <w:b/>
+          <w:i w:val="0"/>
+          <w:sz w:val="28"/>
+        </w:rPr>
         <w:t xml:space="preserve">5 Параметризация модели по данным национальной экономики</w:t>
       </w:r>
     </w:p>
@@ -26529,8 +26734,16 @@
     <w:p>
       <w:pPr>
         <w:pStyle w:val="Heading2"/>
-      </w:pPr>
-      <w:r>
+        <w:ind w:firstLine="709" w:left="0"/>
+        <w:jc w:val="left"/>
+      </w:pPr>
+      <w:r>
+        <w:rPr>
+          <w:rFonts w:ascii="Times New Roman" w:hAnsi="Times New Roman"/>
+          <w:b/>
+          <w:i w:val="0"/>
+          <w:sz w:val="28"/>
+        </w:rPr>
         <w:t xml:space="preserve">5.1 Источники данных и их калибровка</w:t>
       </w:r>
     </w:p>
@@ -26863,8 +27076,16 @@
     <w:p>
       <w:pPr>
         <w:pStyle w:val="Heading2"/>
-      </w:pPr>
-      <w:r>
+        <w:ind w:firstLine="709" w:left="0"/>
+        <w:jc w:val="left"/>
+      </w:pPr>
+      <w:r>
+        <w:rPr>
+          <w:rFonts w:ascii="Times New Roman" w:hAnsi="Times New Roman"/>
+          <w:b/>
+          <w:i w:val="0"/>
+          <w:sz w:val="28"/>
+        </w:rPr>
         <w:t xml:space="preserve">5.2 Параметры микроуровня</w:t>
       </w:r>
     </w:p>
@@ -26872,8 +27093,16 @@
     <w:p>
       <w:pPr>
         <w:pStyle w:val="Heading3"/>
-      </w:pPr>
-      <w:r>
+        <w:ind w:firstLine="709" w:left="0"/>
+        <w:jc w:val="left"/>
+      </w:pPr>
+      <w:r>
+        <w:rPr>
+          <w:rFonts w:ascii="Times New Roman" w:hAnsi="Times New Roman"/>
+          <w:b/>
+          <w:i w:val="0"/>
+          <w:sz w:val="28"/>
+        </w:rPr>
         <w:t xml:space="preserve">5.2.1 Матрица промежуточных затрат и вектор валового выпуска</w:t>
       </w:r>
     </w:p>
@@ -27531,8 +27760,16 @@
     <w:p>
       <w:pPr>
         <w:pStyle w:val="Heading3"/>
-      </w:pPr>
-      <w:r>
+        <w:ind w:firstLine="709" w:left="0"/>
+        <w:jc w:val="left"/>
+      </w:pPr>
+      <w:r>
+        <w:rPr>
+          <w:rFonts w:ascii="Times New Roman" w:hAnsi="Times New Roman"/>
+          <w:b/>
+          <w:i w:val="0"/>
+          <w:sz w:val="28"/>
+        </w:rPr>
         <w:t xml:space="preserve">5.2.2 Матрица прямых затрат</w:t>
       </w:r>
     </w:p>
@@ -27705,6 +27942,8 @@
     <w:p>
       <w:pPr>
         <w:pStyle w:val="FirstParagraph"/>
+        <w:ind w:firstLine="0" w:left="0"/>
+        <w:jc w:val="left"/>
       </w:pPr>
       <w:r>
         <w:t xml:space="preserve">где</w:t>
@@ -27873,6 +28112,9 @@
     <w:p>
       <w:pPr>
         <w:pStyle w:val="BodyText"/>
+        <w:spacing w:before="120" w:after="120"/>
+        <w:ind w:firstLine="0" w:left="0"/>
+        <w:jc w:val="center"/>
       </w:pPr>
       <m:oMath>
         <m:r>
@@ -27925,6 +28167,8 @@
     <w:p>
       <w:pPr>
         <w:pStyle w:val="BodyText"/>
+        <w:ind w:firstLine="0" w:left="0"/>
+        <w:jc w:val="left"/>
       </w:pPr>
       <w:r>
         <w:t xml:space="preserve">где</w:t>
@@ -28595,8 +28839,16 @@
     <w:p>
       <w:pPr>
         <w:pStyle w:val="Heading3"/>
-      </w:pPr>
-      <w:r>
+        <w:ind w:firstLine="709" w:left="0"/>
+        <w:jc w:val="left"/>
+      </w:pPr>
+      <w:r>
+        <w:rPr>
+          <w:rFonts w:ascii="Times New Roman" w:hAnsi="Times New Roman"/>
+          <w:b/>
+          <w:i w:val="0"/>
+          <w:sz w:val="28"/>
+        </w:rPr>
         <w:t xml:space="preserve">5.2.3 Матрица капиталоемкости и псевдообратная матрица</w:t>
       </w:r>
     </w:p>
@@ -30309,8 +30561,16 @@
     <w:p>
       <w:pPr>
         <w:pStyle w:val="Heading3"/>
-      </w:pPr>
-      <w:r>
+        <w:ind w:firstLine="709" w:left="0"/>
+        <w:jc w:val="left"/>
+      </w:pPr>
+      <w:r>
+        <w:rPr>
+          <w:rFonts w:ascii="Times New Roman" w:hAnsi="Times New Roman"/>
+          <w:b/>
+          <w:i w:val="0"/>
+          <w:sz w:val="28"/>
+        </w:rPr>
         <w:t xml:space="preserve">5.2.4 Вектор конечного спроса</w:t>
       </w:r>
     </w:p>
@@ -31040,8 +31300,16 @@
     <w:p>
       <w:pPr>
         <w:pStyle w:val="Heading2"/>
-      </w:pPr>
-      <w:r>
+        <w:ind w:firstLine="709" w:left="0"/>
+        <w:jc w:val="left"/>
+      </w:pPr>
+      <w:r>
+        <w:rPr>
+          <w:rFonts w:ascii="Times New Roman" w:hAnsi="Times New Roman"/>
+          <w:b/>
+          <w:i w:val="0"/>
+          <w:sz w:val="28"/>
+        </w:rPr>
         <w:t xml:space="preserve">5.3 Макроуровень. Начальные условия для фирм</w:t>
       </w:r>
     </w:p>
@@ -31442,6 +31710,8 @@
     <w:p>
       <w:pPr>
         <w:pStyle w:val="BodyText"/>
+        <w:ind w:firstLine="0" w:left="0"/>
+        <w:jc w:val="left"/>
       </w:pPr>
       <w:r>
         <w:t xml:space="preserve">где</w:t>
@@ -31694,8 +31964,16 @@
     <w:p>
       <w:pPr>
         <w:pStyle w:val="Heading3"/>
-      </w:pPr>
-      <w:r>
+        <w:ind w:firstLine="709" w:left="0"/>
+        <w:jc w:val="left"/>
+      </w:pPr>
+      <w:r>
+        <w:rPr>
+          <w:rFonts w:ascii="Times New Roman" w:hAnsi="Times New Roman"/>
+          <w:b/>
+          <w:i w:val="0"/>
+          <w:sz w:val="28"/>
+        </w:rPr>
         <w:t xml:space="preserve">5.3.1 Начальный запас капитала</w:t>
       </w:r>
     </w:p>
@@ -31756,6 +32034,9 @@
     <w:p>
       <w:pPr>
         <w:pStyle w:val="BodyText"/>
+        <w:spacing w:before="120" w:after="120"/>
+        <w:ind w:firstLine="0" w:left="0"/>
+        <w:jc w:val="center"/>
       </w:pPr>
       <m:oMath>
         <m:sSub>
@@ -31997,6 +32278,9 @@
     <w:p>
       <w:pPr>
         <w:pStyle w:val="BodyText"/>
+        <w:spacing w:before="120" w:after="120"/>
+        <w:ind w:firstLine="0" w:left="0"/>
+        <w:jc w:val="center"/>
       </w:pPr>
       <m:oMath>
         <m:sSub>
@@ -32135,6 +32419,9 @@
     <w:p>
       <w:pPr>
         <w:pStyle w:val="BodyText"/>
+        <w:spacing w:before="120" w:after="120"/>
+        <w:ind w:firstLine="0" w:left="0"/>
+        <w:jc w:val="center"/>
       </w:pPr>
       <m:oMath>
         <m:sSub>
@@ -32402,6 +32689,9 @@
     <w:p>
       <w:pPr>
         <w:pStyle w:val="BodyText"/>
+        <w:spacing w:before="120" w:after="120"/>
+        <w:ind w:firstLine="0" w:left="0"/>
+        <w:jc w:val="center"/>
       </w:pPr>
       <m:oMath>
         <m:sSub>
@@ -33194,8 +33484,16 @@
     <w:p>
       <w:pPr>
         <w:pStyle w:val="Heading3"/>
-      </w:pPr>
-      <w:r>
+        <w:ind w:firstLine="709" w:left="0"/>
+        <w:jc w:val="left"/>
+      </w:pPr>
+      <w:r>
+        <w:rPr>
+          <w:rFonts w:ascii="Times New Roman" w:hAnsi="Times New Roman"/>
+          <w:b/>
+          <w:i w:val="0"/>
+          <w:sz w:val="28"/>
+        </w:rPr>
         <w:t xml:space="preserve">5.3.2 Технологический уровень</w:t>
       </w:r>
     </w:p>
@@ -33239,6 +33537,9 @@
     <w:p>
       <w:pPr>
         <w:pStyle w:val="BodyText"/>
+        <w:spacing w:before="120" w:after="120"/>
+        <w:ind w:firstLine="0" w:left="0"/>
+        <w:jc w:val="center"/>
       </w:pPr>
       <m:oMath>
         <m:sSub>
@@ -34019,8 +34320,16 @@
     <w:p>
       <w:pPr>
         <w:pStyle w:val="Heading3"/>
-      </w:pPr>
-      <w:r>
+        <w:ind w:firstLine="709" w:left="0"/>
+        <w:jc w:val="left"/>
+      </w:pPr>
+      <w:r>
+        <w:rPr>
+          <w:rFonts w:ascii="Times New Roman" w:hAnsi="Times New Roman"/>
+          <w:b/>
+          <w:i w:val="0"/>
+          <w:sz w:val="28"/>
+        </w:rPr>
         <w:t xml:space="preserve">5.3.3 Рыночные доли и индивидуальные технологические коэффициенты</w:t>
       </w:r>
     </w:p>
@@ -34035,6 +34344,9 @@
     <w:p>
       <w:pPr>
         <w:pStyle w:val="BodyText"/>
+        <w:spacing w:before="120" w:after="120"/>
+        <w:ind w:firstLine="0" w:left="0"/>
+        <w:jc w:val="center"/>
       </w:pPr>
       <m:oMath>
         <m:sSub>
@@ -34246,6 +34558,9 @@
     <w:p>
       <w:pPr>
         <w:pStyle w:val="BodyText"/>
+        <w:spacing w:before="120" w:after="120"/>
+        <w:ind w:firstLine="0" w:left="0"/>
+        <w:jc w:val="center"/>
       </w:pPr>
       <m:oMath>
         <m:sSubSup>
@@ -34541,6 +34856,9 @@
     <w:p>
       <w:pPr>
         <w:pStyle w:val="BodyText"/>
+        <w:spacing w:before="120" w:after="120"/>
+        <w:ind w:firstLine="0" w:left="0"/>
+        <w:jc w:val="center"/>
       </w:pPr>
       <m:oMath>
         <m:sSubSup>
@@ -34808,8 +35126,16 @@
     <w:p>
       <w:pPr>
         <w:pStyle w:val="Heading3"/>
-      </w:pPr>
-      <w:r>
+        <w:ind w:firstLine="709" w:left="0"/>
+        <w:jc w:val="left"/>
+      </w:pPr>
+      <w:r>
+        <w:rPr>
+          <w:rFonts w:ascii="Times New Roman" w:hAnsi="Times New Roman"/>
+          <w:b/>
+          <w:i w:val="0"/>
+          <w:sz w:val="28"/>
+        </w:rPr>
         <w:t xml:space="preserve">5.3.4 Постоянные издержки и инвестиционные доли</w:t>
       </w:r>
     </w:p>
@@ -34853,6 +35179,9 @@
     <w:p>
       <w:pPr>
         <w:pStyle w:val="BodyText"/>
+        <w:spacing w:before="120" w:after="120"/>
+        <w:ind w:firstLine="0" w:left="0"/>
+        <w:jc w:val="center"/>
       </w:pPr>
       <m:oMath>
         <m:sSub>
@@ -35040,6 +35369,8 @@
     <w:p>
       <w:pPr>
         <w:pStyle w:val="BodyText"/>
+        <w:ind w:firstLine="0" w:left="0"/>
+        <w:jc w:val="left"/>
       </w:pPr>
       <w:r>
         <w:t xml:space="preserve">где</w:t>
@@ -35648,8 +35979,16 @@
     <w:p>
       <w:pPr>
         <w:pStyle w:val="Heading2"/>
-      </w:pPr>
-      <w:r>
+        <w:ind w:firstLine="709" w:left="0"/>
+        <w:jc w:val="left"/>
+      </w:pPr>
+      <w:r>
+        <w:rPr>
+          <w:rFonts w:ascii="Times New Roman" w:hAnsi="Times New Roman"/>
+          <w:b/>
+          <w:i w:val="0"/>
+          <w:sz w:val="28"/>
+        </w:rPr>
         <w:t xml:space="preserve">5.4 Калибровка отраслевых параметров</w:t>
       </w:r>
     </w:p>
@@ -36324,6 +36663,8 @@
     <w:p>
       <w:pPr>
         <w:pStyle w:val="FirstParagraph"/>
+        <w:ind w:firstLine="0" w:left="0"/>
+        <w:jc w:val="left"/>
       </w:pPr>
       <w:r>
         <w:t xml:space="preserve">где</w:t>
@@ -36522,6 +36863,9 @@
     <w:p>
       <w:pPr>
         <w:pStyle w:val="BodyText"/>
+        <w:spacing w:before="120" w:after="120"/>
+        <w:ind w:firstLine="0" w:left="0"/>
+        <w:jc w:val="center"/>
       </w:pPr>
       <m:oMath>
         <m:sSub>
@@ -36577,6 +36921,8 @@
     <w:p>
       <w:pPr>
         <w:pStyle w:val="BodyText"/>
+        <w:ind w:firstLine="0" w:left="0"/>
+        <w:jc w:val="left"/>
       </w:pPr>
       <w:r>
         <w:t xml:space="preserve">где</w:t>
@@ -37184,6 +37530,8 @@
     <w:p>
       <w:pPr>
         <w:pStyle w:val="FirstParagraph"/>
+        <w:ind w:firstLine="0" w:left="0"/>
+        <w:jc w:val="left"/>
       </w:pPr>
       <w:r>
         <w:t xml:space="preserve">где</w:t>
@@ -37832,6 +38180,8 @@
     <w:p>
       <w:pPr>
         <w:pStyle w:val="FirstParagraph"/>
+        <w:ind w:firstLine="0" w:left="0"/>
+        <w:jc w:val="left"/>
       </w:pPr>
       <w:r>
         <w:t xml:space="preserve">где</w:t>
@@ -38250,6 +38600,9 @@
     <w:p>
       <w:pPr>
         <w:pStyle w:val="BodyText"/>
+        <w:spacing w:before="120" w:after="120"/>
+        <w:ind w:firstLine="0" w:left="0"/>
+        <w:jc w:val="center"/>
       </w:pPr>
       <w:r>
         <w:t xml:space="preserve">$</w:t>
@@ -38862,6 +39215,8 @@
     <w:p>
       <w:pPr>
         <w:pStyle w:val="BodyText"/>
+        <w:ind w:firstLine="0" w:left="0"/>
+        <w:jc w:val="left"/>
       </w:pPr>
       <w:r>
         <w:t xml:space="preserve">где</w:t>
@@ -39334,6 +39689,9 @@
     <w:p>
       <w:pPr>
         <w:pStyle w:val="BodyText"/>
+        <w:spacing w:before="120" w:after="120"/>
+        <w:ind w:firstLine="0" w:left="0"/>
+        <w:jc w:val="center"/>
       </w:pPr>
       <m:oMath>
         <m:sSub>
@@ -40886,8 +41244,16 @@
     <w:p>
       <w:pPr>
         <w:pStyle w:val="Heading2"/>
-      </w:pPr>
-      <w:r>
+        <w:ind w:firstLine="709" w:left="0"/>
+        <w:jc w:val="left"/>
+      </w:pPr>
+      <w:r>
+        <w:rPr>
+          <w:rFonts w:ascii="Times New Roman" w:hAnsi="Times New Roman"/>
+          <w:b/>
+          <w:i w:val="0"/>
+          <w:sz w:val="28"/>
+        </w:rPr>
         <w:t xml:space="preserve">5.5 Итерационная структура модели и процедура передачи параметров</w:t>
       </w:r>
     </w:p>
@@ -41236,6 +41602,8 @@
     <w:p>
       <w:pPr>
         <w:pStyle w:val="FirstParagraph"/>
+        <w:ind w:firstLine="0" w:left="0"/>
+        <w:jc w:val="left"/>
       </w:pPr>
       <w:r>
         <w:t xml:space="preserve">где</w:t>
@@ -42617,8 +42985,16 @@
     <w:p>
       <w:pPr>
         <w:pStyle w:val="Heading2"/>
-      </w:pPr>
-      <w:r>
+        <w:ind w:firstLine="709" w:left="0"/>
+        <w:jc w:val="left"/>
+      </w:pPr>
+      <w:r>
+        <w:rPr>
+          <w:rFonts w:ascii="Times New Roman" w:hAnsi="Times New Roman"/>
+          <w:b/>
+          <w:i w:val="0"/>
+          <w:sz w:val="28"/>
+        </w:rPr>
         <w:t xml:space="preserve">5.6 Верификация начальных условий</w:t>
       </w:r>
     </w:p>
@@ -44116,8 +44492,16 @@
     <w:p>
       <w:pPr>
         <w:pStyle w:val="Heading2"/>
-      </w:pPr>
-      <w:r>
+        <w:ind w:firstLine="709" w:left="0"/>
+        <w:jc w:val="left"/>
+      </w:pPr>
+      <w:r>
+        <w:rPr>
+          <w:rFonts w:ascii="Times New Roman" w:hAnsi="Times New Roman"/>
+          <w:b/>
+          <w:i w:val="0"/>
+          <w:sz w:val="28"/>
+        </w:rPr>
         <w:t xml:space="preserve">5.7 Результаты симуляции: анализ макро- и микродинамики</w:t>
       </w:r>
     </w:p>
@@ -44156,8 +44540,16 @@
     <w:p>
       <w:pPr>
         <w:pStyle w:val="Heading3"/>
-      </w:pPr>
-      <w:r>
+        <w:ind w:firstLine="709" w:left="0"/>
+        <w:jc w:val="left"/>
+      </w:pPr>
+      <w:r>
+        <w:rPr>
+          <w:rFonts w:ascii="Times New Roman" w:hAnsi="Times New Roman"/>
+          <w:b/>
+          <w:i w:val="0"/>
+          <w:sz w:val="28"/>
+        </w:rPr>
         <w:t xml:space="preserve">5.7.1 Макроэкономическая траектория</w:t>
       </w:r>
     </w:p>
@@ -44772,8 +45164,16 @@
     <w:p>
       <w:pPr>
         <w:pStyle w:val="Heading3"/>
-      </w:pPr>
-      <w:r>
+        <w:ind w:firstLine="709" w:left="0"/>
+        <w:jc w:val="left"/>
+      </w:pPr>
+      <w:r>
+        <w:rPr>
+          <w:rFonts w:ascii="Times New Roman" w:hAnsi="Times New Roman"/>
+          <w:b/>
+          <w:i w:val="0"/>
+          <w:sz w:val="28"/>
+        </w:rPr>
         <w:t xml:space="preserve">5.7.2 Технологический дрейф и устойчивость матрицы прямых затрат</w:t>
       </w:r>
     </w:p>
@@ -45608,8 +46008,16 @@
     <w:p>
       <w:pPr>
         <w:pStyle w:val="Heading3"/>
-      </w:pPr>
-      <w:r>
+        <w:ind w:firstLine="709" w:left="0"/>
+        <w:jc w:val="left"/>
+      </w:pPr>
+      <w:r>
+        <w:rPr>
+          <w:rFonts w:ascii="Times New Roman" w:hAnsi="Times New Roman"/>
+          <w:b/>
+          <w:i w:val="0"/>
+          <w:sz w:val="28"/>
+        </w:rPr>
         <w:t xml:space="preserve">5.7.3 Накопление капитала и микро-макро взаимодействие</w:t>
       </w:r>
     </w:p>
@@ -46240,8 +46648,16 @@
     <w:p>
       <w:pPr>
         <w:pStyle w:val="Heading3"/>
-      </w:pPr>
-      <w:r>
+        <w:ind w:firstLine="709" w:left="0"/>
+        <w:jc w:val="left"/>
+      </w:pPr>
+      <w:r>
+        <w:rPr>
+          <w:rFonts w:ascii="Times New Roman" w:hAnsi="Times New Roman"/>
+          <w:b/>
+          <w:i w:val="0"/>
+          <w:sz w:val="28"/>
+        </w:rPr>
         <w:t xml:space="preserve">5.7.4 Инвестиционные волны и механизм циклических пульсов</w:t>
       </w:r>
     </w:p>
@@ -46752,8 +47168,16 @@
     <w:p>
       <w:pPr>
         <w:pStyle w:val="Heading3"/>
-      </w:pPr>
-      <w:r>
+        <w:ind w:firstLine="709" w:left="0"/>
+        <w:jc w:val="left"/>
+      </w:pPr>
+      <w:r>
+        <w:rPr>
+          <w:rFonts w:ascii="Times New Roman" w:hAnsi="Times New Roman"/>
+          <w:b/>
+          <w:i w:val="0"/>
+          <w:sz w:val="28"/>
+        </w:rPr>
         <w:t xml:space="preserve">5.7.5 Рыночная концентрация и устойчивость конкурентной структуры</w:t>
       </w:r>
     </w:p>
@@ -47375,8 +47799,16 @@
     <w:p>
       <w:pPr>
         <w:pStyle w:val="Heading3"/>
-      </w:pPr>
-      <w:r>
+        <w:ind w:firstLine="709" w:left="0"/>
+        <w:jc w:val="left"/>
+      </w:pPr>
+      <w:r>
+        <w:rPr>
+          <w:rFonts w:ascii="Times New Roman" w:hAnsi="Times New Roman"/>
+          <w:b/>
+          <w:i w:val="0"/>
+          <w:sz w:val="28"/>
+        </w:rPr>
         <w:t xml:space="preserve">5.7.6 Верификация динамического баланса</w:t>
       </w:r>
     </w:p>
@@ -48041,8 +48473,16 @@
     <w:p>
       <w:pPr>
         <w:pStyle w:val="Heading1"/>
-      </w:pPr>
-      <w:r>
+        <w:ind w:firstLine="0" w:left="0"/>
+        <w:jc w:val="center"/>
+      </w:pPr>
+      <w:r>
+        <w:rPr>
+          <w:rFonts w:ascii="Times New Roman" w:hAnsi="Times New Roman"/>
+          <w:b/>
+          <w:i w:val="0"/>
+          <w:sz w:val="28"/>
+        </w:rPr>
         <w:t xml:space="preserve">ЗАКЛЮЧЕНИЕ</w:t>
       </w:r>
     </w:p>
@@ -48994,50 +49434,38 @@
     </w:p>
     <w:p>
       <w:pPr>
-        <w:pStyle w:val="Compact"/>
-        <w:numPr>
-          <w:ilvl w:val="0"/>
-          <w:numId w:val="1012"/>
-        </w:numPr>
-      </w:pPr>
-      <w:r>
-        <w:t xml:space="preserve">расширение числа секторов и агентов для повышения детализации производственной структуры;</w:t>
-      </w:r>
-    </w:p>
-    <w:p>
-      <w:pPr>
-        <w:pStyle w:val="Compact"/>
-        <w:numPr>
-          <w:ilvl w:val="0"/>
-          <w:numId w:val="1012"/>
-        </w:numPr>
-      </w:pPr>
-      <w:r>
-        <w:t xml:space="preserve">введение финансового блока, моделирующего кредитование инвестиций;</w:t>
-      </w:r>
-    </w:p>
-    <w:p>
-      <w:pPr>
-        <w:pStyle w:val="Compact"/>
-        <w:numPr>
-          <w:ilvl w:val="0"/>
-          <w:numId w:val="1012"/>
-        </w:numPr>
-      </w:pPr>
-      <w:r>
-        <w:t xml:space="preserve">сценарный анализ реакции системы на точечные технологические шоки в отдельных отраслях;</w:t>
-      </w:r>
-    </w:p>
-    <w:p>
-      <w:pPr>
-        <w:pStyle w:val="Compact"/>
-        <w:numPr>
-          <w:ilvl w:val="0"/>
-          <w:numId w:val="1012"/>
-        </w:numPr>
-      </w:pPr>
-      <w:r>
-        <w:t xml:space="preserve">верификация результатов симуляции на альтернативных базах данных межотраслевых балансов.</w:t>
+        <w:spacing w:before="0" w:after="0"/>
+        <w:ind w:left="992" w:hanging="283"/>
+      </w:pPr>
+      <w:r>
+        <w:t>-- расширение числа секторов и агентов для повышения детализации производственной структуры;</w:t>
+      </w:r>
+    </w:p>
+    <w:p>
+      <w:pPr>
+        <w:spacing w:before="0" w:after="0"/>
+        <w:ind w:left="992" w:hanging="283"/>
+      </w:pPr>
+      <w:r>
+        <w:t>-- введение финансового блока, моделирующего кредитование инвестиций;</w:t>
+      </w:r>
+    </w:p>
+    <w:p>
+      <w:pPr>
+        <w:spacing w:before="0" w:after="0"/>
+        <w:ind w:left="992" w:hanging="283"/>
+      </w:pPr>
+      <w:r>
+        <w:t>-- сценарный анализ реакции системы на точечные технологические шоки в отдельных отраслях;</w:t>
+      </w:r>
+    </w:p>
+    <w:p>
+      <w:pPr>
+        <w:spacing w:before="0" w:after="0"/>
+        <w:ind w:left="992" w:hanging="283"/>
+      </w:pPr>
+      <w:r>
+        <w:t>-- верификация результатов симуляции на альтернативных базах данных межотраслевых балансов.</w:t>
       </w:r>
     </w:p>
     <w:bookmarkEnd w:id="67"/>
@@ -49045,130 +49473,116 @@
     <w:p>
       <w:pPr>
         <w:pStyle w:val="Heading1"/>
-      </w:pPr>
-      <w:r>
+        <w:ind w:firstLine="0" w:left="0"/>
+        <w:jc w:val="center"/>
+      </w:pPr>
+      <w:r>
+        <w:rPr>
+          <w:rFonts w:ascii="Times New Roman" w:hAnsi="Times New Roman"/>
+          <w:b/>
+          <w:i w:val="0"/>
+          <w:sz w:val="28"/>
+        </w:rPr>
         <w:t xml:space="preserve">СПИСОК ИСПОЛЬЗОВАННЫХ ИСТОЧНИКОВ</w:t>
       </w:r>
     </w:p>
     <w:p>
       <w:pPr>
-        <w:numPr>
-          <w:ilvl w:val="0"/>
-          <w:numId w:val="1013"/>
-        </w:numPr>
-      </w:pPr>
-      <w:r>
-        <w:t xml:space="preserve">Леонтьев В.В. Межотраслевая экономика / пер. с англ. – М.: Экономика, 1997. – 479 с.</w:t>
-      </w:r>
-    </w:p>
-    <w:p>
-      <w:pPr>
-        <w:numPr>
-          <w:ilvl w:val="0"/>
-          <w:numId w:val="1013"/>
-        </w:numPr>
-      </w:pPr>
-      <w:r>
-        <w:t xml:space="preserve">Юдин С.В. Математика и экономические модели: учебное пособие. – М., 2020. – 412 с.</w:t>
-      </w:r>
-    </w:p>
-    <w:p>
-      <w:pPr>
-        <w:numPr>
-          <w:ilvl w:val="0"/>
-          <w:numId w:val="1013"/>
-        </w:numPr>
-      </w:pPr>
-      <w:r>
-        <w:t xml:space="preserve">Попов А.М., Сотников В.Н. Экономико-математические методы и модели: учебник / под ред. А.М. Попова. – 2-е изд. – М.: Юрайт, 2021. – 480 с.</w:t>
-      </w:r>
-    </w:p>
-    <w:p>
-      <w:pPr>
-        <w:numPr>
-          <w:ilvl w:val="0"/>
-          <w:numId w:val="1013"/>
-        </w:numPr>
-      </w:pPr>
-      <w:r>
-        <w:t xml:space="preserve">Кундышева Е.С. Математические методы и модели в экономике: учебное пособие. – М.: Дашков, 2020. – 352 с.</w:t>
-      </w:r>
-    </w:p>
-    <w:p>
-      <w:pPr>
-        <w:numPr>
-          <w:ilvl w:val="0"/>
-          <w:numId w:val="1013"/>
-        </w:numPr>
-      </w:pPr>
-      <w:r>
-        <w:t xml:space="preserve">Jodar L., Merello P. Solving an analytic dynamic Leontief model with time dependent capital matrix // Mathematical and Computer Modelling. – 2010. – Vol. 51. – P. 400–404.</w:t>
-      </w:r>
-    </w:p>
-    <w:p>
-      <w:pPr>
-        <w:numPr>
-          <w:ilvl w:val="0"/>
-          <w:numId w:val="1013"/>
-        </w:numPr>
-      </w:pPr>
-      <w:r>
-        <w:t xml:space="preserve">Акопов А. С. Имитационное моделирование: учебник и практикум для вузов / А. С. Акопов. – 2-е изд., перераб. и доп. – Москва: Издательство Юрайт, 2024. – 426 с. – ISBN 978-5-534-18379-5.</w:t>
-      </w:r>
-    </w:p>
-    <w:p>
-      <w:pPr>
-        <w:numPr>
-          <w:ilvl w:val="0"/>
-          <w:numId w:val="1013"/>
-        </w:numPr>
-      </w:pPr>
-      <w:r>
-        <w:t xml:space="preserve">Каталевский Д.Ю. Основы имитационного моделирования и системного анализа в управлении: учебное пособие. – 2-е изд., перераб. и доп. – М.: Издательский дом «Дело» РАНХиГС, 2015. – 496 с. – ISBN 978-5-7749-1072-4.</w:t>
-      </w:r>
-    </w:p>
-    <w:p>
-      <w:pPr>
-        <w:numPr>
-          <w:ilvl w:val="0"/>
-          <w:numId w:val="1013"/>
-        </w:numPr>
-      </w:pPr>
-      <w:r>
-        <w:t xml:space="preserve">Никаноров С. О., Павлова Н. Г. Динамическая модель Леонтьева с непрерывным временем как управляемая система. 2023. DOI: 10.25728/mlsd.2023.0299.</w:t>
-      </w:r>
-    </w:p>
-    <w:p>
-      <w:pPr>
-        <w:numPr>
-          <w:ilvl w:val="0"/>
-          <w:numId w:val="1013"/>
-        </w:numPr>
-      </w:pPr>
-      <w:r>
-        <w:t xml:space="preserve">Цыплаков А. А. Агентное моделирование многоотраслевой пространственной экономики: автореферат диссертации на соискание ученой степени доктора экономических наук. Новосибирск, 2024.</w:t>
-      </w:r>
-    </w:p>
-    <w:p>
-      <w:pPr>
-        <w:numPr>
-          <w:ilvl w:val="0"/>
-          <w:numId w:val="1013"/>
-        </w:numPr>
-      </w:pPr>
-      <w:r>
-        <w:t xml:space="preserve">Леонтьев В. В. Экономические эссе. Москва: Политиздат, 1990.</w:t>
-      </w:r>
-    </w:p>
-    <w:p>
-      <w:pPr>
-        <w:numPr>
-          <w:ilvl w:val="0"/>
-          <w:numId w:val="1013"/>
-        </w:numPr>
-      </w:pPr>
-      <w:r>
-        <w:t xml:space="preserve">Ермольев Ю. М., Ястремский А. И. Стохастические модели и методы в экономическом планировании. Москва: Наука, 1979.</w:t>
+        <w:spacing w:before="0" w:after="0"/>
+        <w:ind w:left="992" w:hanging="283"/>
+      </w:pPr>
+      <w:r>
+        <w:t>-- Леонтьев В.В. Межотраслевая экономика / пер. с англ. – М.: Экономика, 1997. – 479 с.</w:t>
+      </w:r>
+    </w:p>
+    <w:p>
+      <w:pPr>
+        <w:spacing w:before="0" w:after="0"/>
+        <w:ind w:left="992" w:hanging="283"/>
+      </w:pPr>
+      <w:r>
+        <w:t>-- Юдин С.В. Математика и экономические модели: учебное пособие. – М., 2020. – 412 с.</w:t>
+      </w:r>
+    </w:p>
+    <w:p>
+      <w:pPr>
+        <w:spacing w:before="0" w:after="0"/>
+        <w:ind w:left="992" w:hanging="283"/>
+      </w:pPr>
+      <w:r>
+        <w:t>-- Попов А.М., Сотников В.Н. Экономико-математические методы и модели: учебник / под ред. А.М. Попова. – 2-е изд. – М.: Юрайт, 2021. – 480 с.</w:t>
+      </w:r>
+    </w:p>
+    <w:p>
+      <w:pPr>
+        <w:spacing w:before="0" w:after="0"/>
+        <w:ind w:left="992" w:hanging="283"/>
+      </w:pPr>
+      <w:r>
+        <w:t>-- Кундышева Е.С. Математические методы и модели в экономике: учебное пособие. – М.: Дашков, 2020. – 352 с.</w:t>
+      </w:r>
+    </w:p>
+    <w:p>
+      <w:pPr>
+        <w:spacing w:before="0" w:after="0"/>
+        <w:ind w:left="992" w:hanging="283"/>
+      </w:pPr>
+      <w:r>
+        <w:t>-- Jodar L., Merello P. Solving an analytic dynamic Leontief model with time dependent capital matrix // Mathematical and Computer Modelling. – 2010. – Vol. 51. – P. 400–404.</w:t>
+      </w:r>
+    </w:p>
+    <w:p>
+      <w:pPr>
+        <w:spacing w:before="0" w:after="0"/>
+        <w:ind w:left="992" w:hanging="283"/>
+      </w:pPr>
+      <w:r>
+        <w:t>-- Акопов А. С. Имитационное моделирование: учебник и практикум для вузов / А. С. Акопов. – 2-е изд., перераб. и доп. – Москва: Издательство Юрайт, 2024. – 426 с. – ISBN 978-5-534-18379-5.</w:t>
+      </w:r>
+    </w:p>
+    <w:p>
+      <w:pPr>
+        <w:spacing w:before="0" w:after="0"/>
+        <w:ind w:left="992" w:hanging="283"/>
+      </w:pPr>
+      <w:r>
+        <w:t>-- Каталевский Д.Ю. Основы имитационного моделирования и системного анализа в управлении: учебное пособие. – 2-е изд., перераб. и доп. – М.: Издательский дом «Дело» РАНХиГС, 2015. – 496 с. – ISBN 978-5-7749-1072-4.</w:t>
+      </w:r>
+    </w:p>
+    <w:p>
+      <w:pPr>
+        <w:spacing w:before="0" w:after="0"/>
+        <w:ind w:left="992" w:hanging="283"/>
+      </w:pPr>
+      <w:r>
+        <w:t>-- Никаноров С. О., Павлова Н. Г. Динамическая модель Леонтьева с непрерывным временем как управляемая система. 2023. DOI: 10.25728/mlsd.2023.0299.</w:t>
+      </w:r>
+    </w:p>
+    <w:p>
+      <w:pPr>
+        <w:spacing w:before="0" w:after="0"/>
+        <w:ind w:left="992" w:hanging="283"/>
+      </w:pPr>
+      <w:r>
+        <w:t>-- Цыплаков А. А. Агентное моделирование многоотраслевой пространственной экономики: автореферат диссертации на соискание ученой степени доктора экономических наук. Новосибирск, 2024.</w:t>
+      </w:r>
+    </w:p>
+    <w:p>
+      <w:pPr>
+        <w:spacing w:before="0" w:after="0"/>
+        <w:ind w:left="992" w:hanging="283"/>
+      </w:pPr>
+      <w:r>
+        <w:t>-- Леонтьев В. В. Экономические эссе. Москва: Политиздат, 1990.</w:t>
+      </w:r>
+    </w:p>
+    <w:p>
+      <w:pPr>
+        <w:spacing w:before="0" w:after="0"/>
+        <w:ind w:left="992" w:hanging="283"/>
+      </w:pPr>
+      <w:r>
+        <w:t>-- Ермольев Ю. М., Ястремский А. И. Стохастические модели и методы в экономическом планировании. Москва: Наука, 1979.</w:t>
       </w:r>
     </w:p>
     <w:bookmarkEnd w:id="68"/>
@@ -50087,7 +50501,7 @@
       <w:b/>
       <w:bCs/>
       <w:color w:themeColor="accent1" w:themeShade="BF" w:val="365F91"/>
-      <w:sz w:val="32"/>
+      <w:sz w:val="28"/>
       <w:szCs w:val="28"/>
     </w:rPr>
   </w:style>
@@ -50104,7 +50518,7 @@
       <w:keepNext/>
       <w:keepLines/>
       <w:spacing w:after="0" w:before="0" w:line="420" w:lineRule="exact"/>
-      <w:jc w:val="both"/>
+      <w:jc w:val="left"/>
       <w:outlineLvl w:val="1"/>
     </w:pPr>
     <w:rPr>
@@ -50112,7 +50526,7 @@
       <w:b/>
       <w:bCs/>
       <w:color w:themeColor="accent1" w:val="4F81BD"/>
-      <w:sz w:val="32"/>
+      <w:sz w:val="28"/>
       <w:szCs w:val="26"/>
     </w:rPr>
   </w:style>
@@ -50129,12 +50543,12 @@
       <w:keepNext/>
       <w:keepLines/>
       <w:spacing w:after="0" w:before="0" w:line="420" w:lineRule="exact"/>
-      <w:jc w:val="both"/>
+      <w:jc w:val="left"/>
       <w:outlineLvl w:val="2"/>
     </w:pPr>
     <w:rPr>
       <w:rFonts w:ascii="Times New Roman" w:asciiTheme="majorHAnsi" w:cstheme="majorBidi" w:eastAsiaTheme="majorEastAsia" w:hAnsi="Times New Roman" w:hAnsiTheme="majorHAnsi"/>
-      <w:b w:val="0"/>
+      <w:b/>
       <w:bCs/>
       <w:i w:val="0"/>
       <w:color w:themeColor="accent1" w:val="4F81BD"/>

</xml_diff>